<commit_message>
Headers in Route Handlers
</commit_message>
<xml_diff>
--- a/NextJs_Notes.docx
+++ b/NextJs_Notes.docx
@@ -42,7 +42,10 @@
               <w:tab w:val="right" w:leader="dot" w:pos="9016"/>
             </w:tabs>
             <w:rPr>
+              <w:rFonts w:asciiTheme="minorHAnsi" w:eastAsiaTheme="minorEastAsia" w:hAnsiTheme="minorHAnsi"/>
               <w:noProof/>
+              <w:szCs w:val="24"/>
+              <w:lang w:eastAsia="en-IN" w:bidi="gu-IN"/>
             </w:rPr>
           </w:pPr>
           <w:r>
@@ -54,7 +57,7 @@
           <w:r>
             <w:fldChar w:fldCharType="separate"/>
           </w:r>
-          <w:hyperlink w:anchor="_Toc196664891" w:history="1">
+          <w:hyperlink w:anchor="_Toc228020301" w:history="1">
             <w:r>
               <w:rPr>
                 <w:rStyle w:val="Hyperlink"/>
@@ -82,7 +85,7 @@
                 <w:noProof/>
                 <w:webHidden/>
               </w:rPr>
-              <w:instrText xml:space="preserve"> PAGEREF _Toc196664891 \h </w:instrText>
+              <w:instrText xml:space="preserve"> PAGEREF _Toc228020301 \h </w:instrText>
             </w:r>
             <w:r>
               <w:rPr>
@@ -114,6 +117,83 @@
           </w:hyperlink>
         </w:p>
         <w:p>
+          <w:pPr>
+            <w:pStyle w:val="TOC1"/>
+            <w:tabs>
+              <w:tab w:val="right" w:leader="dot" w:pos="9016"/>
+            </w:tabs>
+            <w:rPr>
+              <w:rFonts w:asciiTheme="minorHAnsi" w:eastAsiaTheme="minorEastAsia" w:hAnsiTheme="minorHAnsi"/>
+              <w:noProof/>
+              <w:szCs w:val="24"/>
+              <w:lang w:eastAsia="en-IN" w:bidi="gu-IN"/>
+            </w:rPr>
+          </w:pPr>
+          <w:hyperlink w:anchor="_Toc228020302" w:history="1">
+            <w:r>
+              <w:rPr>
+                <w:rStyle w:val="Hyperlink"/>
+                <w:noProof/>
+                <w:lang w:val="en-US"/>
+              </w:rPr>
+              <w:t>2) Intercepting routes</w:t>
+            </w:r>
+            <w:r>
+              <w:rPr>
+                <w:noProof/>
+                <w:webHidden/>
+              </w:rPr>
+              <w:tab/>
+            </w:r>
+            <w:r>
+              <w:rPr>
+                <w:noProof/>
+                <w:webHidden/>
+              </w:rPr>
+              <w:fldChar w:fldCharType="begin"/>
+            </w:r>
+            <w:r>
+              <w:rPr>
+                <w:noProof/>
+                <w:webHidden/>
+              </w:rPr>
+              <w:instrText xml:space="preserve"> PAGEREF _Toc228020302 \h </w:instrText>
+            </w:r>
+            <w:r>
+              <w:rPr>
+                <w:noProof/>
+                <w:webHidden/>
+              </w:rPr>
+            </w:r>
+            <w:r>
+              <w:rPr>
+                <w:noProof/>
+                <w:webHidden/>
+              </w:rPr>
+              <w:fldChar w:fldCharType="separate"/>
+            </w:r>
+            <w:r>
+              <w:rPr>
+                <w:noProof/>
+                <w:webHidden/>
+              </w:rPr>
+              <w:t>4</w:t>
+            </w:r>
+            <w:r>
+              <w:rPr>
+                <w:noProof/>
+                <w:webHidden/>
+              </w:rPr>
+              <w:fldChar w:fldCharType="end"/>
+            </w:r>
+          </w:hyperlink>
+        </w:p>
+        <w:p>
+          <w:pPr>
+            <w:tabs>
+              <w:tab w:val="left" w:pos="1715"/>
+            </w:tabs>
+          </w:pPr>
           <w:r>
             <w:rPr>
               <w:b/>
@@ -122,6 +202,14 @@
             </w:rPr>
             <w:fldChar w:fldCharType="end"/>
           </w:r>
+          <w:r>
+            <w:rPr>
+              <w:b/>
+              <w:bCs/>
+              <w:noProof/>
+            </w:rPr>
+            <w:tab/>
+          </w:r>
         </w:p>
       </w:sdtContent>
     </w:sdt>
@@ -152,7 +240,7 @@
           <w:lang w:val="en-US"/>
         </w:rPr>
       </w:pPr>
-      <w:bookmarkStart w:id="0" w:name="_Toc196664891"/>
+      <w:bookmarkStart w:id="0" w:name="_Toc228020301"/>
       <w:r>
         <w:rPr>
           <w:lang w:val="en-US"/>
@@ -169,7 +257,35 @@
         <w:rPr>
           <w:lang w:val="en-US"/>
         </w:rPr>
-        <w:t>To recover from errors and to reset, Why reset() along is sufficient?</w:t>
+        <w:t xml:space="preserve">To recover from errors and to reset, </w:t>
+      </w:r>
+      <w:proofErr w:type="gramStart"/>
+      <w:r>
+        <w:rPr>
+          <w:lang w:val="en-US"/>
+        </w:rPr>
+        <w:t>Why</w:t>
+      </w:r>
+      <w:proofErr w:type="gramEnd"/>
+      <w:r>
+        <w:rPr>
+          <w:lang w:val="en-US"/>
+        </w:rPr>
+        <w:t xml:space="preserve"> </w:t>
+      </w:r>
+      <w:proofErr w:type="gramStart"/>
+      <w:r>
+        <w:rPr>
+          <w:lang w:val="en-US"/>
+        </w:rPr>
+        <w:t>reset(</w:t>
+      </w:r>
+      <w:proofErr w:type="gramEnd"/>
+      <w:r>
+        <w:rPr>
+          <w:lang w:val="en-US"/>
+        </w:rPr>
+        <w:t>) along is sufficient?</w:t>
       </w:r>
       <w:bookmarkEnd w:id="0"/>
     </w:p>
@@ -190,7 +306,21 @@
         <w:rPr>
           <w:lang w:val="en-US"/>
         </w:rPr>
-        <w:t xml:space="preserve">If you want to look for a whole story (meaning explaination) visit, </w:t>
+        <w:t xml:space="preserve">If you want to look for a whole story (meaning </w:t>
+      </w:r>
+      <w:proofErr w:type="spellStart"/>
+      <w:r>
+        <w:rPr>
+          <w:lang w:val="en-US"/>
+        </w:rPr>
+        <w:t>explaination</w:t>
+      </w:r>
+      <w:proofErr w:type="spellEnd"/>
+      <w:r>
+        <w:rPr>
+          <w:lang w:val="en-US"/>
+        </w:rPr>
+        <w:t xml:space="preserve">) visit, </w:t>
       </w:r>
     </w:p>
     <w:p>
@@ -224,8 +354,13 @@
       </w:pPr>
     </w:p>
     <w:p>
-      <w:r>
-        <w:t xml:space="preserve">Ahhh okay, now you are asking a </w:t>
+      <w:proofErr w:type="spellStart"/>
+      <w:r>
+        <w:t>Ahhh</w:t>
+      </w:r>
+      <w:proofErr w:type="spellEnd"/>
+      <w:r>
+        <w:t xml:space="preserve"> okay, now you are asking a </w:t>
       </w:r>
       <w:r>
         <w:rPr>
@@ -255,7 +390,15 @@
         <w:t>Next.js App Router</w:t>
       </w:r>
       <w:r>
-        <w:t xml:space="preserve">, just calling reset() </w:t>
+        <w:t xml:space="preserve">, just calling </w:t>
+      </w:r>
+      <w:proofErr w:type="gramStart"/>
+      <w:r>
+        <w:t>reset(</w:t>
+      </w:r>
+      <w:proofErr w:type="gramEnd"/>
+      <w:r>
+        <w:t xml:space="preserve">) </w:t>
       </w:r>
       <w:r>
         <w:rPr>
@@ -275,7 +418,17 @@
         <w:t>often doesn't work properly</w:t>
       </w:r>
       <w:r>
-        <w:t xml:space="preserve"> — you usually have to call router.refresh() too.</w:t>
+        <w:t xml:space="preserve"> — you usually have to call </w:t>
+      </w:r>
+      <w:proofErr w:type="spellStart"/>
+      <w:proofErr w:type="gramStart"/>
+      <w:r>
+        <w:t>router.refresh</w:t>
+      </w:r>
+      <w:proofErr w:type="spellEnd"/>
+      <w:proofErr w:type="gramEnd"/>
+      <w:r>
+        <w:t>() too.</w:t>
       </w:r>
     </w:p>
     <w:p>
@@ -296,7 +449,23 @@
           <w:b/>
           <w:bCs/>
         </w:rPr>
-        <w:t>1. What reset() actually does in Next.js (App Router)?</w:t>
+        <w:t xml:space="preserve">1. What </w:t>
+      </w:r>
+      <w:proofErr w:type="gramStart"/>
+      <w:r>
+        <w:rPr>
+          <w:b/>
+          <w:bCs/>
+        </w:rPr>
+        <w:t>reset(</w:t>
+      </w:r>
+      <w:proofErr w:type="gramEnd"/>
+      <w:r>
+        <w:rPr>
+          <w:b/>
+          <w:bCs/>
+        </w:rPr>
+        <w:t>) actually does in Next.js (App Router)?</w:t>
       </w:r>
     </w:p>
     <w:p>
@@ -306,8 +475,13 @@
           <w:numId w:val="1"/>
         </w:numPr>
       </w:pPr>
-      <w:r>
-        <w:t xml:space="preserve">reset() </w:t>
+      <w:proofErr w:type="gramStart"/>
+      <w:r>
+        <w:t>reset(</w:t>
+      </w:r>
+      <w:proofErr w:type="gramEnd"/>
+      <w:r>
+        <w:t xml:space="preserve">) </w:t>
       </w:r>
       <w:r>
         <w:rPr>
@@ -390,7 +564,15 @@
         <w:t>if the error was due to a client-side issue (like some React rendering crash)</w:t>
       </w:r>
       <w:r>
-        <w:t xml:space="preserve"> → reset() works fine.</w:t>
+        <w:t xml:space="preserve"> → </w:t>
+      </w:r>
+      <w:proofErr w:type="gramStart"/>
+      <w:r>
+        <w:t>reset(</w:t>
+      </w:r>
+      <w:proofErr w:type="gramEnd"/>
+      <w:r>
+        <w:t>) works fine.</w:t>
       </w:r>
     </w:p>
     <w:p>
@@ -411,14 +593,38 @@
         <w:t>if the error came from the server (like a fetch failed inside a Server Component)</w:t>
       </w:r>
       <w:r>
-        <w:t xml:space="preserve"> → reset() alone </w:t>
-      </w:r>
-      <w:r>
-        <w:rPr>
-          <w:b/>
-          <w:bCs/>
-        </w:rPr>
-        <w:t>won't refetch the server-side data</w:t>
+        <w:t xml:space="preserve"> → </w:t>
+      </w:r>
+      <w:proofErr w:type="gramStart"/>
+      <w:r>
+        <w:t>reset(</w:t>
+      </w:r>
+      <w:proofErr w:type="gramEnd"/>
+      <w:r>
+        <w:t xml:space="preserve">) alone </w:t>
+      </w:r>
+      <w:r>
+        <w:rPr>
+          <w:b/>
+          <w:bCs/>
+        </w:rPr>
+        <w:t xml:space="preserve">won't </w:t>
+      </w:r>
+      <w:proofErr w:type="spellStart"/>
+      <w:r>
+        <w:rPr>
+          <w:b/>
+          <w:bCs/>
+        </w:rPr>
+        <w:t>refetch</w:t>
+      </w:r>
+      <w:proofErr w:type="spellEnd"/>
+      <w:r>
+        <w:rPr>
+          <w:b/>
+          <w:bCs/>
+        </w:rPr>
+        <w:t xml:space="preserve"> the server-side data</w:t>
       </w:r>
       <w:r>
         <w:t>.</w:t>
@@ -437,7 +643,25 @@
           <w:b/>
           <w:bCs/>
         </w:rPr>
-        <w:t>2. Why do we need router.refresh()?</w:t>
+        <w:t xml:space="preserve">2. Why do we need </w:t>
+      </w:r>
+      <w:proofErr w:type="spellStart"/>
+      <w:proofErr w:type="gramStart"/>
+      <w:r>
+        <w:rPr>
+          <w:b/>
+          <w:bCs/>
+        </w:rPr>
+        <w:t>router.refresh</w:t>
+      </w:r>
+      <w:proofErr w:type="spellEnd"/>
+      <w:proofErr w:type="gramEnd"/>
+      <w:r>
+        <w:rPr>
+          <w:b/>
+          <w:bCs/>
+        </w:rPr>
+        <w:t>()?</w:t>
       </w:r>
     </w:p>
     <w:p>
@@ -447,8 +671,15 @@
           <w:numId w:val="2"/>
         </w:numPr>
       </w:pPr>
-      <w:r>
-        <w:t xml:space="preserve">router.refresh() </w:t>
+      <w:proofErr w:type="spellStart"/>
+      <w:proofErr w:type="gramStart"/>
+      <w:r>
+        <w:t>router.refresh</w:t>
+      </w:r>
+      <w:proofErr w:type="spellEnd"/>
+      <w:proofErr w:type="gramEnd"/>
+      <w:r>
+        <w:t xml:space="preserve">() </w:t>
       </w:r>
       <w:r>
         <w:rPr>
@@ -469,7 +700,15 @@
         </w:numPr>
       </w:pPr>
       <w:r>
-        <w:t>It's similar to a "soft reload" without losing client-side state like a full page refresh.</w:t>
+        <w:t xml:space="preserve">It's similar to a "soft reload" without losing client-side state like a </w:t>
+      </w:r>
+      <w:proofErr w:type="gramStart"/>
+      <w:r>
+        <w:t>full page</w:t>
+      </w:r>
+      <w:proofErr w:type="gramEnd"/>
+      <w:r>
+        <w:t xml:space="preserve"> refresh.</w:t>
       </w:r>
     </w:p>
     <w:p>
@@ -480,7 +719,17 @@
         <w:t>✅</w:t>
       </w:r>
       <w:r>
-        <w:t xml:space="preserve"> When you use router.refresh(), you </w:t>
+        <w:t xml:space="preserve"> When you use </w:t>
+      </w:r>
+      <w:proofErr w:type="spellStart"/>
+      <w:proofErr w:type="gramStart"/>
+      <w:r>
+        <w:t>router.refresh</w:t>
+      </w:r>
+      <w:proofErr w:type="spellEnd"/>
+      <w:proofErr w:type="gramEnd"/>
+      <w:r>
+        <w:t xml:space="preserve">(), you </w:t>
       </w:r>
       <w:r>
         <w:rPr>
@@ -506,7 +755,23 @@
           <w:b/>
           <w:bCs/>
         </w:rPr>
-        <w:t>3. Why startTransition?</w:t>
+        <w:t xml:space="preserve">3. Why </w:t>
+      </w:r>
+      <w:proofErr w:type="spellStart"/>
+      <w:r>
+        <w:rPr>
+          <w:b/>
+          <w:bCs/>
+        </w:rPr>
+        <w:t>startTransition</w:t>
+      </w:r>
+      <w:proofErr w:type="spellEnd"/>
+      <w:r>
+        <w:rPr>
+          <w:b/>
+          <w:bCs/>
+        </w:rPr>
+        <w:t>?</w:t>
       </w:r>
     </w:p>
     <w:p>
@@ -516,8 +781,13 @@
           <w:numId w:val="3"/>
         </w:numPr>
       </w:pPr>
-      <w:r>
-        <w:t>startTransition tells React "</w:t>
+      <w:proofErr w:type="spellStart"/>
+      <w:r>
+        <w:t>startTransition</w:t>
+      </w:r>
+      <w:proofErr w:type="spellEnd"/>
+      <w:r>
+        <w:t xml:space="preserve"> tells React "</w:t>
       </w:r>
       <w:r>
         <w:rPr>
@@ -543,10 +813,29 @@
           <w:bCs/>
         </w:rPr>
         <w:lastRenderedPageBreak/>
-        <w:t>Without startTransition</w:t>
-      </w:r>
-      <w:r>
-        <w:t xml:space="preserve">, calling router.refresh() </w:t>
+        <w:t xml:space="preserve">Without </w:t>
+      </w:r>
+      <w:proofErr w:type="spellStart"/>
+      <w:r>
+        <w:rPr>
+          <w:b/>
+          <w:bCs/>
+        </w:rPr>
+        <w:t>startTransition</w:t>
+      </w:r>
+      <w:proofErr w:type="spellEnd"/>
+      <w:r>
+        <w:t xml:space="preserve">, calling </w:t>
+      </w:r>
+      <w:proofErr w:type="spellStart"/>
+      <w:proofErr w:type="gramStart"/>
+      <w:r>
+        <w:t>router.refresh</w:t>
+      </w:r>
+      <w:proofErr w:type="spellEnd"/>
+      <w:proofErr w:type="gramEnd"/>
+      <w:r>
+        <w:t xml:space="preserve">() </w:t>
       </w:r>
       <w:r>
         <w:rPr>
@@ -571,15 +860,32 @@
           <w:b/>
           <w:bCs/>
         </w:rPr>
-        <w:t>With startTransition</w:t>
-      </w:r>
+        <w:t xml:space="preserve">With </w:t>
+      </w:r>
+      <w:proofErr w:type="spellStart"/>
+      <w:r>
+        <w:rPr>
+          <w:b/>
+          <w:bCs/>
+        </w:rPr>
+        <w:t>startTransition</w:t>
+      </w:r>
+      <w:proofErr w:type="spellEnd"/>
       <w:r>
         <w:t>, React knows it's a background action, and keeps the app feeling smooth.</w:t>
       </w:r>
     </w:p>
     <w:p>
       <w:r>
-        <w:t>(React 18 introduced startTransition for UX smoothness.)</w:t>
+        <w:t xml:space="preserve">(React 18 introduced </w:t>
+      </w:r>
+      <w:proofErr w:type="spellStart"/>
+      <w:r>
+        <w:t>startTransition</w:t>
+      </w:r>
+      <w:proofErr w:type="spellEnd"/>
+      <w:r>
+        <w:t xml:space="preserve"> for UX smoothness.)</w:t>
       </w:r>
     </w:p>
     <w:p/>
@@ -590,12 +896,21 @@
           <w:bCs/>
         </w:rPr>
       </w:pPr>
-      <w:r>
-        <w:rPr>
-          <w:b/>
-          <w:bCs/>
-        </w:rPr>
-        <w:t>So your final flow:</w:t>
+      <w:proofErr w:type="gramStart"/>
+      <w:r>
+        <w:rPr>
+          <w:b/>
+          <w:bCs/>
+        </w:rPr>
+        <w:t>So</w:t>
+      </w:r>
+      <w:proofErr w:type="gramEnd"/>
+      <w:r>
+        <w:rPr>
+          <w:b/>
+          <w:bCs/>
+        </w:rPr>
+        <w:t xml:space="preserve"> your final flow:</w:t>
       </w:r>
     </w:p>
     <w:tbl>
@@ -657,8 +972,13 @@
             <w:pPr>
               <w:spacing w:after="160" w:line="259" w:lineRule="auto"/>
             </w:pPr>
+            <w:proofErr w:type="gramStart"/>
             <w:r>
-              <w:t>reset() only</w:t>
+              <w:t>reset(</w:t>
+            </w:r>
+            <w:proofErr w:type="gramEnd"/>
+            <w:r>
+              <w:t>) only</w:t>
             </w:r>
           </w:p>
         </w:tc>
@@ -689,8 +1009,15 @@
             <w:pPr>
               <w:spacing w:after="160" w:line="259" w:lineRule="auto"/>
             </w:pPr>
+            <w:proofErr w:type="spellStart"/>
+            <w:proofErr w:type="gramStart"/>
             <w:r>
-              <w:t>router.refresh()</w:t>
+              <w:t>router.refresh</w:t>
+            </w:r>
+            <w:proofErr w:type="spellEnd"/>
+            <w:proofErr w:type="gramEnd"/>
+            <w:r>
+              <w:t>()</w:t>
             </w:r>
           </w:p>
         </w:tc>
@@ -705,7 +1032,15 @@
               <w:cnfStyle w:val="000000000000" w:firstRow="0" w:lastRow="0" w:firstColumn="0" w:lastColumn="0" w:oddVBand="0" w:evenVBand="0" w:oddHBand="0" w:evenHBand="0" w:firstRowFirstColumn="0" w:firstRowLastColumn="0" w:lastRowFirstColumn="0" w:lastRowLastColumn="0"/>
             </w:pPr>
             <w:r>
-              <w:t>Forces full route refresh, server components refetch — fixing server-side errors.</w:t>
+              <w:t xml:space="preserve">Forces full route refresh, server components </w:t>
+            </w:r>
+            <w:proofErr w:type="spellStart"/>
+            <w:r>
+              <w:t>refetch</w:t>
+            </w:r>
+            <w:proofErr w:type="spellEnd"/>
+            <w:r>
+              <w:t xml:space="preserve"> — fixing server-side errors.</w:t>
             </w:r>
           </w:p>
         </w:tc>
@@ -724,9 +1059,11 @@
             <w:pPr>
               <w:spacing w:after="160" w:line="259" w:lineRule="auto"/>
             </w:pPr>
+            <w:proofErr w:type="spellStart"/>
             <w:r>
               <w:t>startTransition</w:t>
             </w:r>
+            <w:proofErr w:type="spellEnd"/>
           </w:p>
         </w:tc>
         <w:tc>
@@ -740,7 +1077,17 @@
               <w:cnfStyle w:val="000000100000" w:firstRow="0" w:lastRow="0" w:firstColumn="0" w:lastColumn="0" w:oddVBand="0" w:evenVBand="0" w:oddHBand="1" w:evenHBand="0" w:firstRowFirstColumn="0" w:firstRowLastColumn="0" w:lastRowFirstColumn="0" w:lastRowLastColumn="0"/>
             </w:pPr>
             <w:r>
-              <w:t>Makes router.refresh smooth in background, not blocking user UI.</w:t>
+              <w:t xml:space="preserve">Makes </w:t>
+            </w:r>
+            <w:proofErr w:type="spellStart"/>
+            <w:proofErr w:type="gramStart"/>
+            <w:r>
+              <w:t>router.refresh</w:t>
+            </w:r>
+            <w:proofErr w:type="spellEnd"/>
+            <w:proofErr w:type="gramEnd"/>
+            <w:r>
+              <w:t xml:space="preserve"> smooth in background, not blocking user UI.</w:t>
             </w:r>
           </w:p>
         </w:tc>
@@ -775,7 +1122,15 @@
         <w:t>✅</w:t>
       </w:r>
       <w:r>
-        <w:t xml:space="preserve"> reset() → resets the error boundary </w:t>
+        <w:t xml:space="preserve"> </w:t>
+      </w:r>
+      <w:proofErr w:type="gramStart"/>
+      <w:r>
+        <w:t>reset(</w:t>
+      </w:r>
+      <w:proofErr w:type="gramEnd"/>
+      <w:r>
+        <w:t xml:space="preserve">) → resets the error boundary </w:t>
       </w:r>
       <w:r>
         <w:rPr>
@@ -796,7 +1151,17 @@
         <w:t>✅</w:t>
       </w:r>
       <w:r>
-        <w:t xml:space="preserve"> router.refresh() → </w:t>
+        <w:t xml:space="preserve"> </w:t>
+      </w:r>
+      <w:proofErr w:type="spellStart"/>
+      <w:proofErr w:type="gramStart"/>
+      <w:r>
+        <w:t>router.refresh</w:t>
+      </w:r>
+      <w:proofErr w:type="spellEnd"/>
+      <w:proofErr w:type="gramEnd"/>
+      <w:r>
+        <w:t xml:space="preserve">() → </w:t>
       </w:r>
       <w:r>
         <w:rPr>
@@ -827,7 +1192,20 @@
         <w:t>✅</w:t>
       </w:r>
       <w:r>
-        <w:t xml:space="preserve"> startTransition() → makes the refresh happen </w:t>
+        <w:t xml:space="preserve"> </w:t>
+      </w:r>
+      <w:proofErr w:type="spellStart"/>
+      <w:proofErr w:type="gramStart"/>
+      <w:r>
+        <w:t>startTransition</w:t>
+      </w:r>
+      <w:proofErr w:type="spellEnd"/>
+      <w:r>
+        <w:t>(</w:t>
+      </w:r>
+      <w:proofErr w:type="gramEnd"/>
+      <w:r>
+        <w:t xml:space="preserve">) → makes the refresh happen </w:t>
       </w:r>
       <w:r>
         <w:rPr>
@@ -858,7 +1236,15 @@
     </w:p>
     <w:p>
       <w:r>
-        <w:t xml:space="preserve">In Next.js App Router, reset() is only a </w:t>
+        <w:t xml:space="preserve">In Next.js App Router, </w:t>
+      </w:r>
+      <w:proofErr w:type="gramStart"/>
+      <w:r>
+        <w:t>reset(</w:t>
+      </w:r>
+      <w:proofErr w:type="gramEnd"/>
+      <w:r>
+        <w:t xml:space="preserve">) is only a </w:t>
       </w:r>
       <w:r>
         <w:rPr>
@@ -872,7 +1258,17 @@
       </w:r>
       <w:r>
         <w:br/>
-        <w:t>If the error came from the server, you must router.refresh() to fix it properly.</w:t>
+        <w:t xml:space="preserve">If the error came from the server, you must </w:t>
+      </w:r>
+      <w:proofErr w:type="spellStart"/>
+      <w:proofErr w:type="gramStart"/>
+      <w:r>
+        <w:t>router.refresh</w:t>
+      </w:r>
+      <w:proofErr w:type="spellEnd"/>
+      <w:proofErr w:type="gramEnd"/>
+      <w:r>
+        <w:t>() to fix it properly.</w:t>
       </w:r>
     </w:p>
     <w:p/>
@@ -880,22 +1276,42 @@
       <w:r>
         <w:t xml:space="preserve">Would you also like me to show a real example of when </w:t>
       </w:r>
-      <w:r>
-        <w:rPr>
-          <w:b/>
-          <w:bCs/>
-        </w:rPr>
-        <w:t>reset() works</w:t>
+      <w:proofErr w:type="gramStart"/>
+      <w:r>
+        <w:rPr>
+          <w:b/>
+          <w:bCs/>
+        </w:rPr>
+        <w:t>reset(</w:t>
+      </w:r>
+      <w:proofErr w:type="gramEnd"/>
+      <w:r>
+        <w:rPr>
+          <w:b/>
+          <w:bCs/>
+        </w:rPr>
+        <w:t>) works</w:t>
       </w:r>
       <w:r>
         <w:t xml:space="preserve"> and when </w:t>
       </w:r>
-      <w:r>
-        <w:rPr>
-          <w:b/>
-          <w:bCs/>
-        </w:rPr>
-        <w:t>router.refresh() is necessary</w:t>
+      <w:proofErr w:type="spellStart"/>
+      <w:proofErr w:type="gramStart"/>
+      <w:r>
+        <w:rPr>
+          <w:b/>
+          <w:bCs/>
+        </w:rPr>
+        <w:t>router.refresh</w:t>
+      </w:r>
+      <w:proofErr w:type="spellEnd"/>
+      <w:proofErr w:type="gramEnd"/>
+      <w:r>
+        <w:rPr>
+          <w:b/>
+          <w:bCs/>
+        </w:rPr>
+        <w:t>() is necessary</w:t>
       </w:r>
       <w:r>
         <w:t xml:space="preserve">? </w:t>
@@ -942,6 +1358,7 @@
           <w:lang w:val="en-US"/>
         </w:rPr>
       </w:pPr>
+      <w:bookmarkStart w:id="1" w:name="_Toc228020302"/>
       <w:r>
         <w:rPr>
           <w:lang w:val="en-US"/>
@@ -949,22 +1366,24 @@
         <w:lastRenderedPageBreak/>
         <w:t>2) Intercepting routes</w:t>
       </w:r>
-    </w:p>
-    <w:p>
-      <w:pPr>
-        <w:rPr>
-          <w:lang w:val="en-US"/>
-        </w:rPr>
-      </w:pPr>
-    </w:p>
-    <w:p>
-      <w:pPr>
-        <w:rPr>
-          <w:lang w:val="en-US"/>
-        </w:rPr>
-      </w:pPr>
-      <w:r>
-        <w:rPr>
+      <w:bookmarkEnd w:id="1"/>
+    </w:p>
+    <w:p>
+      <w:pPr>
+        <w:rPr>
+          <w:lang w:val="en-US"/>
+        </w:rPr>
+      </w:pPr>
+    </w:p>
+    <w:p>
+      <w:pPr>
+        <w:rPr>
+          <w:lang w:val="en-US"/>
+        </w:rPr>
+      </w:pPr>
+      <w:r>
+        <w:rPr>
+          <w:noProof/>
           <w:lang w:val="en-US"/>
         </w:rPr>
         <w:drawing>
@@ -1019,6 +1438,7 @@
       </w:pPr>
       <w:r>
         <w:rPr>
+          <w:noProof/>
           <w:lang w:val="en-US"/>
         </w:rPr>
         <w:drawing>
@@ -1057,6 +1477,69 @@
           </wp:inline>
         </w:drawing>
       </w:r>
+    </w:p>
+    <w:p>
+      <w:pPr>
+        <w:rPr>
+          <w:lang w:val="en-US"/>
+        </w:rPr>
+      </w:pPr>
+    </w:p>
+    <w:p>
+      <w:pPr>
+        <w:rPr>
+          <w:lang w:val="en-US"/>
+        </w:rPr>
+      </w:pPr>
+    </w:p>
+    <w:p>
+      <w:pPr>
+        <w:rPr>
+          <w:lang w:val="en-US"/>
+        </w:rPr>
+      </w:pPr>
+    </w:p>
+    <w:p>
+      <w:pPr>
+        <w:rPr>
+          <w:lang w:val="en-US"/>
+        </w:rPr>
+      </w:pPr>
+    </w:p>
+    <w:p>
+      <w:pPr>
+        <w:rPr>
+          <w:lang w:val="en-US"/>
+        </w:rPr>
+      </w:pPr>
+    </w:p>
+    <w:p>
+      <w:pPr>
+        <w:rPr>
+          <w:lang w:val="en-US"/>
+        </w:rPr>
+      </w:pPr>
+    </w:p>
+    <w:p>
+      <w:pPr>
+        <w:rPr>
+          <w:lang w:val="en-US"/>
+        </w:rPr>
+      </w:pPr>
+    </w:p>
+    <w:p>
+      <w:pPr>
+        <w:rPr>
+          <w:lang w:val="en-US"/>
+        </w:rPr>
+      </w:pPr>
+    </w:p>
+    <w:p>
+      <w:pPr>
+        <w:rPr>
+          <w:lang w:val="en-US"/>
+        </w:rPr>
+      </w:pPr>
     </w:p>
     <w:sectPr>
       <w:pgSz w:w="11906" w:h="16838"/>

</xml_diff>

<commit_message>
Redirects in Route Handlers
</commit_message>
<xml_diff>
--- a/NextJs_Notes.docx
+++ b/NextJs_Notes.docx
@@ -1536,6 +1536,1523 @@
     </w:p>
     <w:p>
       <w:pPr>
+        <w:pStyle w:val="Heading1"/>
+      </w:pPr>
+      <w:r>
+        <w:lastRenderedPageBreak/>
+        <w:t xml:space="preserve">3) </w:t>
+      </w:r>
+      <w:r>
+        <w:t>Difference between Request and NextRequest</w:t>
+      </w:r>
+    </w:p>
+    <w:p/>
+    <w:p>
+      <w:r>
+        <w:t xml:space="preserve">Good question — this is a </w:t>
+      </w:r>
+      <w:r>
+        <w:rPr>
+          <w:b/>
+          <w:bCs/>
+        </w:rPr>
+        <w:t>very important distinction in Next.js (App Router)</w:t>
+      </w:r>
+      <w:r>
+        <w:t xml:space="preserve"> </w:t>
+      </w:r>
+      <w:r>
+        <w:rPr>
+          <w:rFonts w:ascii="Segoe UI Emoji" w:hAnsi="Segoe UI Emoji" w:cs="Segoe UI Emoji"/>
+        </w:rPr>
+        <w:t>👇</w:t>
+      </w:r>
+    </w:p>
+    <w:p/>
+    <w:p>
+      <w:pPr>
+        <w:rPr>
+          <w:b/>
+          <w:bCs/>
+        </w:rPr>
+      </w:pPr>
+      <w:r>
+        <w:rPr>
+          <w:rFonts w:ascii="Segoe UI Emoji" w:hAnsi="Segoe UI Emoji" w:cs="Segoe UI Emoji"/>
+          <w:b/>
+          <w:bCs/>
+        </w:rPr>
+        <w:t>🔹</w:t>
+      </w:r>
+      <w:r>
+        <w:rPr>
+          <w:b/>
+          <w:bCs/>
+        </w:rPr>
+        <w:t xml:space="preserve"> 1. Request (Web Standard)</w:t>
+      </w:r>
+    </w:p>
+    <w:p>
+      <w:r>
+        <w:t xml:space="preserve">Request is part of the </w:t>
+      </w:r>
+      <w:r>
+        <w:rPr>
+          <w:b/>
+          <w:bCs/>
+        </w:rPr>
+        <w:t>standard Web API (Fetch API)</w:t>
+      </w:r>
+      <w:r>
+        <w:t xml:space="preserve"> — not specific to Next.js.</w:t>
+      </w:r>
+    </w:p>
+    <w:p>
+      <w:pPr>
+        <w:rPr>
+          <w:b/>
+          <w:bCs/>
+        </w:rPr>
+      </w:pPr>
+      <w:r>
+        <w:rPr>
+          <w:rFonts w:ascii="Segoe UI Emoji" w:hAnsi="Segoe UI Emoji" w:cs="Segoe UI Emoji"/>
+          <w:b/>
+          <w:bCs/>
+        </w:rPr>
+        <w:t>✅</w:t>
+      </w:r>
+      <w:r>
+        <w:rPr>
+          <w:b/>
+          <w:bCs/>
+        </w:rPr>
+        <w:t xml:space="preserve"> Comes from:</w:t>
+      </w:r>
+    </w:p>
+    <w:p>
+      <w:pPr>
+        <w:numPr>
+          <w:ilvl w:val="0"/>
+          <w:numId w:val="4"/>
+        </w:numPr>
+      </w:pPr>
+      <w:r>
+        <w:t>Browser / Node.js (via Fetch API)</w:t>
+      </w:r>
+    </w:p>
+    <w:p>
+      <w:pPr>
+        <w:numPr>
+          <w:ilvl w:val="0"/>
+          <w:numId w:val="4"/>
+        </w:numPr>
+      </w:pPr>
+      <w:r>
+        <w:t>Used in frameworks like Express (indirectly), Cloudflare Workers, etc.</w:t>
+      </w:r>
+    </w:p>
+    <w:p>
+      <w:pPr>
+        <w:rPr>
+          <w:b/>
+          <w:bCs/>
+        </w:rPr>
+      </w:pPr>
+      <w:r>
+        <w:rPr>
+          <w:rFonts w:ascii="Segoe UI Emoji" w:hAnsi="Segoe UI Emoji" w:cs="Segoe UI Emoji"/>
+          <w:b/>
+          <w:bCs/>
+        </w:rPr>
+        <w:t>✅</w:t>
+      </w:r>
+      <w:r>
+        <w:rPr>
+          <w:b/>
+          <w:bCs/>
+        </w:rPr>
+        <w:t xml:space="preserve"> Example:</w:t>
+      </w:r>
+    </w:p>
+    <w:p>
+      <w:r>
+        <w:t xml:space="preserve">export async function </w:t>
+      </w:r>
+      <w:proofErr w:type="gramStart"/>
+      <w:r>
+        <w:t>POST(</w:t>
+      </w:r>
+      <w:proofErr w:type="gramEnd"/>
+      <w:r>
+        <w:t>request: Request) {</w:t>
+      </w:r>
+    </w:p>
+    <w:p>
+      <w:r>
+        <w:t xml:space="preserve">  </w:t>
+      </w:r>
+      <w:proofErr w:type="spellStart"/>
+      <w:r>
+        <w:t>const</w:t>
+      </w:r>
+      <w:proofErr w:type="spellEnd"/>
+      <w:r>
+        <w:t xml:space="preserve"> body = await </w:t>
+      </w:r>
+      <w:proofErr w:type="spellStart"/>
+      <w:proofErr w:type="gramStart"/>
+      <w:r>
+        <w:t>request.json</w:t>
+      </w:r>
+      <w:proofErr w:type="spellEnd"/>
+      <w:proofErr w:type="gramEnd"/>
+      <w:r>
+        <w:t>();</w:t>
+      </w:r>
+    </w:p>
+    <w:p>
+      <w:r>
+        <w:t xml:space="preserve">  return </w:t>
+      </w:r>
+      <w:proofErr w:type="spellStart"/>
+      <w:r>
+        <w:t>Response.json</w:t>
+      </w:r>
+      <w:proofErr w:type="spellEnd"/>
+      <w:proofErr w:type="gramStart"/>
+      <w:r>
+        <w:t>({ data</w:t>
+      </w:r>
+      <w:proofErr w:type="gramEnd"/>
+      <w:r>
+        <w:t xml:space="preserve">: </w:t>
+      </w:r>
+      <w:proofErr w:type="gramStart"/>
+      <w:r>
+        <w:t>body }</w:t>
+      </w:r>
+      <w:proofErr w:type="gramEnd"/>
+      <w:r>
+        <w:t>);</w:t>
+      </w:r>
+    </w:p>
+    <w:p>
+      <w:r>
+        <w:t>}</w:t>
+      </w:r>
+    </w:p>
+    <w:p>
+      <w:pPr>
+        <w:rPr>
+          <w:b/>
+          <w:bCs/>
+        </w:rPr>
+      </w:pPr>
+      <w:r>
+        <w:rPr>
+          <w:rFonts w:ascii="Segoe UI Emoji" w:hAnsi="Segoe UI Emoji" w:cs="Segoe UI Emoji"/>
+          <w:b/>
+          <w:bCs/>
+        </w:rPr>
+        <w:t>✅</w:t>
+      </w:r>
+      <w:r>
+        <w:rPr>
+          <w:b/>
+          <w:bCs/>
+        </w:rPr>
+        <w:t xml:space="preserve"> Features:</w:t>
+      </w:r>
+    </w:p>
+    <w:p>
+      <w:pPr>
+        <w:numPr>
+          <w:ilvl w:val="0"/>
+          <w:numId w:val="5"/>
+        </w:numPr>
+      </w:pPr>
+      <w:proofErr w:type="spellStart"/>
+      <w:proofErr w:type="gramStart"/>
+      <w:r>
+        <w:t>request.json</w:t>
+      </w:r>
+      <w:proofErr w:type="spellEnd"/>
+      <w:proofErr w:type="gramEnd"/>
+      <w:r>
+        <w:t xml:space="preserve">(), </w:t>
+      </w:r>
+      <w:proofErr w:type="spellStart"/>
+      <w:r>
+        <w:t>request.</w:t>
+      </w:r>
+      <w:proofErr w:type="gramStart"/>
+      <w:r>
+        <w:t>text</w:t>
+      </w:r>
+      <w:proofErr w:type="spellEnd"/>
+      <w:r>
+        <w:t>(</w:t>
+      </w:r>
+      <w:proofErr w:type="gramEnd"/>
+      <w:r>
+        <w:t xml:space="preserve">), </w:t>
+      </w:r>
+      <w:proofErr w:type="spellStart"/>
+      <w:proofErr w:type="gramStart"/>
+      <w:r>
+        <w:t>request.formData</w:t>
+      </w:r>
+      <w:proofErr w:type="spellEnd"/>
+      <w:proofErr w:type="gramEnd"/>
+      <w:r>
+        <w:t>()</w:t>
+      </w:r>
+    </w:p>
+    <w:p>
+      <w:pPr>
+        <w:numPr>
+          <w:ilvl w:val="0"/>
+          <w:numId w:val="5"/>
+        </w:numPr>
+      </w:pPr>
+      <w:proofErr w:type="spellStart"/>
+      <w:proofErr w:type="gramStart"/>
+      <w:r>
+        <w:t>request.headers</w:t>
+      </w:r>
+      <w:proofErr w:type="spellEnd"/>
+      <w:proofErr w:type="gramEnd"/>
+    </w:p>
+    <w:p>
+      <w:pPr>
+        <w:numPr>
+          <w:ilvl w:val="0"/>
+          <w:numId w:val="5"/>
+        </w:numPr>
+      </w:pPr>
+      <w:proofErr w:type="spellStart"/>
+      <w:proofErr w:type="gramStart"/>
+      <w:r>
+        <w:t>request.method</w:t>
+      </w:r>
+      <w:proofErr w:type="spellEnd"/>
+      <w:proofErr w:type="gramEnd"/>
+    </w:p>
+    <w:p>
+      <w:pPr>
+        <w:numPr>
+          <w:ilvl w:val="0"/>
+          <w:numId w:val="5"/>
+        </w:numPr>
+      </w:pPr>
+      <w:r>
+        <w:t>request.url</w:t>
+      </w:r>
+    </w:p>
+    <w:p>
+      <w:r>
+        <w:rPr>
+          <w:rFonts w:ascii="Segoe UI Emoji" w:hAnsi="Segoe UI Emoji" w:cs="Segoe UI Emoji"/>
+        </w:rPr>
+        <w:t>👉</w:t>
+      </w:r>
+      <w:r>
+        <w:t xml:space="preserve"> </w:t>
+      </w:r>
+      <w:r>
+        <w:rPr>
+          <w:b/>
+          <w:bCs/>
+        </w:rPr>
+        <w:t>No Next.js-specific helpers</w:t>
+      </w:r>
+    </w:p>
+    <w:p/>
+    <w:p>
+      <w:pPr>
+        <w:rPr>
+          <w:b/>
+          <w:bCs/>
+        </w:rPr>
+      </w:pPr>
+      <w:r>
+        <w:rPr>
+          <w:rFonts w:ascii="Segoe UI Emoji" w:hAnsi="Segoe UI Emoji" w:cs="Segoe UI Emoji"/>
+          <w:b/>
+          <w:bCs/>
+        </w:rPr>
+        <w:t>🔹</w:t>
+      </w:r>
+      <w:r>
+        <w:rPr>
+          <w:b/>
+          <w:bCs/>
+        </w:rPr>
+        <w:t xml:space="preserve"> 2. NextRequest (Next.js Extended)</w:t>
+      </w:r>
+    </w:p>
+    <w:p>
+      <w:r>
+        <w:t xml:space="preserve">NextRequest is a </w:t>
+      </w:r>
+      <w:r>
+        <w:rPr>
+          <w:b/>
+          <w:bCs/>
+        </w:rPr>
+        <w:t>wrapper around the standard Request</w:t>
+      </w:r>
+      <w:r>
+        <w:t>, provided by Next.js.</w:t>
+      </w:r>
+    </w:p>
+    <w:p>
+      <w:pPr>
+        <w:rPr>
+          <w:b/>
+          <w:bCs/>
+        </w:rPr>
+      </w:pPr>
+      <w:r>
+        <w:rPr>
+          <w:rFonts w:ascii="Segoe UI Emoji" w:hAnsi="Segoe UI Emoji" w:cs="Segoe UI Emoji"/>
+          <w:b/>
+          <w:bCs/>
+        </w:rPr>
+        <w:t>✅</w:t>
+      </w:r>
+      <w:r>
+        <w:rPr>
+          <w:b/>
+          <w:bCs/>
+        </w:rPr>
+        <w:t xml:space="preserve"> Comes from:</w:t>
+      </w:r>
+    </w:p>
+    <w:p>
+      <w:r>
+        <w:t xml:space="preserve">import </w:t>
+      </w:r>
+      <w:proofErr w:type="gramStart"/>
+      <w:r>
+        <w:t>{ NextRequest</w:t>
+      </w:r>
+      <w:proofErr w:type="gramEnd"/>
+      <w:r>
+        <w:t xml:space="preserve"> } from 'next/server';</w:t>
+      </w:r>
+    </w:p>
+    <w:p>
+      <w:pPr>
+        <w:rPr>
+          <w:b/>
+          <w:bCs/>
+        </w:rPr>
+      </w:pPr>
+      <w:r>
+        <w:rPr>
+          <w:rFonts w:ascii="Segoe UI Emoji" w:hAnsi="Segoe UI Emoji" w:cs="Segoe UI Emoji"/>
+          <w:b/>
+          <w:bCs/>
+        </w:rPr>
+        <w:t>✅</w:t>
+      </w:r>
+      <w:r>
+        <w:rPr>
+          <w:b/>
+          <w:bCs/>
+        </w:rPr>
+        <w:t xml:space="preserve"> Example:</w:t>
+      </w:r>
+    </w:p>
+    <w:p>
+      <w:r>
+        <w:t xml:space="preserve">import </w:t>
+      </w:r>
+      <w:proofErr w:type="gramStart"/>
+      <w:r>
+        <w:t>{ NextRequest</w:t>
+      </w:r>
+      <w:proofErr w:type="gramEnd"/>
+      <w:r>
+        <w:t xml:space="preserve"> } from 'next/server';</w:t>
+      </w:r>
+    </w:p>
+    <w:p/>
+    <w:p>
+      <w:r>
+        <w:t xml:space="preserve">export function </w:t>
+      </w:r>
+      <w:proofErr w:type="gramStart"/>
+      <w:r>
+        <w:t>GET(</w:t>
+      </w:r>
+      <w:proofErr w:type="gramEnd"/>
+      <w:r>
+        <w:t>request: NextRequest) {</w:t>
+      </w:r>
+    </w:p>
+    <w:p>
+      <w:r>
+        <w:t xml:space="preserve">  </w:t>
+      </w:r>
+      <w:proofErr w:type="spellStart"/>
+      <w:r>
+        <w:t>const</w:t>
+      </w:r>
+      <w:proofErr w:type="spellEnd"/>
+      <w:r>
+        <w:t xml:space="preserve"> </w:t>
+      </w:r>
+      <w:proofErr w:type="spellStart"/>
+      <w:r>
+        <w:t>url</w:t>
+      </w:r>
+      <w:proofErr w:type="spellEnd"/>
+      <w:r>
+        <w:t xml:space="preserve"> = </w:t>
+      </w:r>
+      <w:proofErr w:type="spellStart"/>
+      <w:proofErr w:type="gramStart"/>
+      <w:r>
+        <w:t>request.nextUrl</w:t>
+      </w:r>
+      <w:proofErr w:type="spellEnd"/>
+      <w:proofErr w:type="gramEnd"/>
+      <w:r>
+        <w:t>;</w:t>
+      </w:r>
+    </w:p>
+    <w:p>
+      <w:r>
+        <w:lastRenderedPageBreak/>
+        <w:t xml:space="preserve">  </w:t>
+      </w:r>
+      <w:proofErr w:type="spellStart"/>
+      <w:r>
+        <w:t>const</w:t>
+      </w:r>
+      <w:proofErr w:type="spellEnd"/>
+      <w:r>
+        <w:t xml:space="preserve"> name = </w:t>
+      </w:r>
+      <w:proofErr w:type="spellStart"/>
+      <w:r>
+        <w:t>url.searchParams.get</w:t>
+      </w:r>
+      <w:proofErr w:type="spellEnd"/>
+      <w:r>
+        <w:t>("name");</w:t>
+      </w:r>
+    </w:p>
+    <w:p/>
+    <w:p>
+      <w:r>
+        <w:t xml:space="preserve">  return </w:t>
+      </w:r>
+      <w:proofErr w:type="spellStart"/>
+      <w:r>
+        <w:t>Response.json</w:t>
+      </w:r>
+      <w:proofErr w:type="spellEnd"/>
+      <w:proofErr w:type="gramStart"/>
+      <w:r>
+        <w:t>({ name</w:t>
+      </w:r>
+      <w:proofErr w:type="gramEnd"/>
+      <w:r>
+        <w:t xml:space="preserve"> });</w:t>
+      </w:r>
+    </w:p>
+    <w:p>
+      <w:r>
+        <w:t>}</w:t>
+      </w:r>
+    </w:p>
+    <w:p>
+      <w:r>
+        <w:pict w14:anchorId="1D25ABE5">
+          <v:rect id="_x0000_i1099" style="width:0;height:1.5pt" o:hralign="center" o:hrstd="t" o:hr="t" fillcolor="#a0a0a0" stroked="f"/>
+        </w:pict>
+      </w:r>
+    </w:p>
+    <w:p>
+      <w:pPr>
+        <w:rPr>
+          <w:b/>
+          <w:bCs/>
+        </w:rPr>
+      </w:pPr>
+      <w:r>
+        <w:rPr>
+          <w:rFonts w:ascii="Segoe UI Emoji" w:hAnsi="Segoe UI Emoji" w:cs="Segoe UI Emoji"/>
+          <w:b/>
+          <w:bCs/>
+        </w:rPr>
+        <w:t>🔥</w:t>
+      </w:r>
+      <w:r>
+        <w:rPr>
+          <w:b/>
+          <w:bCs/>
+        </w:rPr>
+        <w:t xml:space="preserve"> Extra Features in NextRequest</w:t>
+      </w:r>
+    </w:p>
+    <w:p>
+      <w:r>
+        <w:t xml:space="preserve">This is where the real difference is </w:t>
+      </w:r>
+      <w:r>
+        <w:rPr>
+          <w:rFonts w:ascii="Segoe UI Emoji" w:hAnsi="Segoe UI Emoji" w:cs="Segoe UI Emoji"/>
+        </w:rPr>
+        <w:t>👇</w:t>
+      </w:r>
+    </w:p>
+    <w:p>
+      <w:pPr>
+        <w:rPr>
+          <w:b/>
+          <w:bCs/>
+        </w:rPr>
+      </w:pPr>
+      <w:r>
+        <w:rPr>
+          <w:b/>
+          <w:bCs/>
+        </w:rPr>
+        <w:t xml:space="preserve">1. </w:t>
+      </w:r>
+      <w:proofErr w:type="spellStart"/>
+      <w:r>
+        <w:rPr>
+          <w:b/>
+          <w:bCs/>
+        </w:rPr>
+        <w:t>nextUrl</w:t>
+      </w:r>
+      <w:proofErr w:type="spellEnd"/>
+      <w:r>
+        <w:rPr>
+          <w:b/>
+          <w:bCs/>
+        </w:rPr>
+        <w:t xml:space="preserve"> (</w:t>
+      </w:r>
+      <w:r>
+        <w:rPr>
+          <w:rFonts w:ascii="Segoe UI Emoji" w:hAnsi="Segoe UI Emoji" w:cs="Segoe UI Emoji"/>
+          <w:b/>
+          <w:bCs/>
+        </w:rPr>
+        <w:t>🔥</w:t>
+      </w:r>
+      <w:r>
+        <w:rPr>
+          <w:b/>
+          <w:bCs/>
+        </w:rPr>
+        <w:t xml:space="preserve"> biggest advantage)</w:t>
+      </w:r>
+    </w:p>
+    <w:p>
+      <w:proofErr w:type="spellStart"/>
+      <w:proofErr w:type="gramStart"/>
+      <w:r>
+        <w:t>request.nextUrl.pathname</w:t>
+      </w:r>
+      <w:proofErr w:type="spellEnd"/>
+      <w:proofErr w:type="gramEnd"/>
+    </w:p>
+    <w:p>
+      <w:proofErr w:type="spellStart"/>
+      <w:proofErr w:type="gramStart"/>
+      <w:r>
+        <w:t>request.nextUrl.searchParams</w:t>
+      </w:r>
+      <w:proofErr w:type="spellEnd"/>
+      <w:proofErr w:type="gramEnd"/>
+    </w:p>
+    <w:p>
+      <w:r>
+        <w:rPr>
+          <w:rFonts w:ascii="Segoe UI Emoji" w:hAnsi="Segoe UI Emoji" w:cs="Segoe UI Emoji"/>
+        </w:rPr>
+        <w:t>👉</w:t>
+      </w:r>
+      <w:r>
+        <w:t xml:space="preserve"> Cleaner URL handling compared to:</w:t>
+      </w:r>
+    </w:p>
+    <w:p>
+      <w:r>
+        <w:t xml:space="preserve">new </w:t>
+      </w:r>
+      <w:proofErr w:type="gramStart"/>
+      <w:r>
+        <w:t>URL(</w:t>
+      </w:r>
+      <w:proofErr w:type="gramEnd"/>
+      <w:r>
+        <w:t>request.url)</w:t>
+      </w:r>
+    </w:p>
+    <w:p>
+      <w:r>
+        <w:pict w14:anchorId="49401F2C">
+          <v:rect id="_x0000_i1100" style="width:0;height:1.5pt" o:hralign="center" o:hrstd="t" o:hr="t" fillcolor="#a0a0a0" stroked="f"/>
+        </w:pict>
+      </w:r>
+    </w:p>
+    <w:p>
+      <w:pPr>
+        <w:rPr>
+          <w:b/>
+          <w:bCs/>
+        </w:rPr>
+      </w:pPr>
+      <w:r>
+        <w:rPr>
+          <w:b/>
+          <w:bCs/>
+        </w:rPr>
+        <w:t>2. Cookies API</w:t>
+      </w:r>
+    </w:p>
+    <w:p>
+      <w:proofErr w:type="spellStart"/>
+      <w:r>
+        <w:t>request.cookies.get</w:t>
+      </w:r>
+      <w:proofErr w:type="spellEnd"/>
+      <w:r>
+        <w:t>("token")</w:t>
+      </w:r>
+    </w:p>
+    <w:p>
+      <w:r>
+        <w:rPr>
+          <w:rFonts w:ascii="Segoe UI Emoji" w:hAnsi="Segoe UI Emoji" w:cs="Segoe UI Emoji"/>
+        </w:rPr>
+        <w:t>👉</w:t>
+      </w:r>
+      <w:r>
+        <w:t xml:space="preserve"> Much easier than parsing headers manually</w:t>
+      </w:r>
+    </w:p>
+    <w:p>
+      <w:r>
+        <w:pict w14:anchorId="3BF8B08E">
+          <v:rect id="_x0000_i1101" style="width:0;height:1.5pt" o:hralign="center" o:hrstd="t" o:hr="t" fillcolor="#a0a0a0" stroked="f"/>
+        </w:pict>
+      </w:r>
+    </w:p>
+    <w:p>
+      <w:pPr>
+        <w:rPr>
+          <w:b/>
+          <w:bCs/>
+        </w:rPr>
+      </w:pPr>
+      <w:r>
+        <w:rPr>
+          <w:b/>
+          <w:bCs/>
+        </w:rPr>
+        <w:t>3. Geo / IP (on supported platforms)</w:t>
+      </w:r>
+    </w:p>
+    <w:p>
+      <w:proofErr w:type="spellStart"/>
+      <w:proofErr w:type="gramStart"/>
+      <w:r>
+        <w:t>request.ip</w:t>
+      </w:r>
+      <w:proofErr w:type="spellEnd"/>
+      <w:proofErr w:type="gramEnd"/>
+    </w:p>
+    <w:p>
+      <w:proofErr w:type="spellStart"/>
+      <w:r>
+        <w:t>request.geo</w:t>
+      </w:r>
+      <w:proofErr w:type="spellEnd"/>
+    </w:p>
+    <w:p>
+      <w:r>
+        <w:pict w14:anchorId="4E99FBB2">
+          <v:rect id="_x0000_i1102" style="width:0;height:1.5pt" o:hralign="center" o:hrstd="t" o:hr="t" fillcolor="#a0a0a0" stroked="f"/>
+        </w:pict>
+      </w:r>
+    </w:p>
+    <w:p>
+      <w:pPr>
+        <w:rPr>
+          <w:b/>
+          <w:bCs/>
+        </w:rPr>
+      </w:pPr>
+      <w:r>
+        <w:rPr>
+          <w:b/>
+          <w:bCs/>
+        </w:rPr>
+        <w:t>4. Middleware Support</w:t>
+      </w:r>
+    </w:p>
+    <w:p>
+      <w:r>
+        <w:t xml:space="preserve">NextRequest is heavily used in </w:t>
+      </w:r>
+      <w:proofErr w:type="spellStart"/>
+      <w:r>
+        <w:rPr>
+          <w:b/>
+          <w:bCs/>
+        </w:rPr>
+        <w:t>middleware.ts</w:t>
+      </w:r>
+      <w:proofErr w:type="spellEnd"/>
+    </w:p>
+    <w:p>
+      <w:r>
+        <w:pict w14:anchorId="0459B9C7">
+          <v:rect id="_x0000_i1103" style="width:0;height:1.5pt" o:hralign="center" o:hrstd="t" o:hr="t" fillcolor="#a0a0a0" stroked="f"/>
+        </w:pict>
+      </w:r>
+    </w:p>
+    <w:p>
+      <w:pPr>
+        <w:rPr>
+          <w:b/>
+          <w:bCs/>
+        </w:rPr>
+      </w:pPr>
+      <w:r>
+        <w:rPr>
+          <w:rFonts w:ascii="Segoe UI Emoji" w:hAnsi="Segoe UI Emoji" w:cs="Segoe UI Emoji"/>
+          <w:b/>
+          <w:bCs/>
+        </w:rPr>
+        <w:t>⚡</w:t>
+      </w:r>
+      <w:r>
+        <w:rPr>
+          <w:b/>
+          <w:bCs/>
+        </w:rPr>
+        <w:t xml:space="preserve"> Key Differences (Quick Table)</w:t>
+      </w:r>
+    </w:p>
+    <w:tbl>
+      <w:tblPr>
+        <w:tblW w:w="0" w:type="auto"/>
+        <w:tblCellSpacing w:w="15" w:type="dxa"/>
+        <w:tblCellMar>
+          <w:top w:w="15" w:type="dxa"/>
+          <w:left w:w="15" w:type="dxa"/>
+          <w:bottom w:w="15" w:type="dxa"/>
+          <w:right w:w="15" w:type="dxa"/>
+        </w:tblCellMar>
+        <w:tblLook w:val="04A0" w:firstRow="1" w:lastRow="0" w:firstColumn="1" w:lastColumn="0" w:noHBand="0" w:noVBand="1"/>
+      </w:tblPr>
+      <w:tblGrid>
+        <w:gridCol w:w="1615"/>
+        <w:gridCol w:w="2067"/>
+        <w:gridCol w:w="2315"/>
+      </w:tblGrid>
+      <w:tr>
+        <w:trPr>
+          <w:tblHeader/>
+          <w:tblCellSpacing w:w="15" w:type="dxa"/>
+        </w:trPr>
+        <w:tc>
+          <w:tcPr>
+            <w:tcW w:w="0" w:type="auto"/>
+            <w:vAlign w:val="center"/>
+            <w:hideMark/>
+          </w:tcPr>
+          <w:p>
+            <w:pPr>
+              <w:rPr>
+                <w:b/>
+                <w:bCs/>
+              </w:rPr>
+            </w:pPr>
+            <w:r>
+              <w:rPr>
+                <w:b/>
+                <w:bCs/>
+              </w:rPr>
+              <w:t>Feature</w:t>
+            </w:r>
+          </w:p>
+        </w:tc>
+        <w:tc>
+          <w:tcPr>
+            <w:tcW w:w="0" w:type="auto"/>
+            <w:vAlign w:val="center"/>
+            <w:hideMark/>
+          </w:tcPr>
+          <w:p>
+            <w:pPr>
+              <w:rPr>
+                <w:b/>
+                <w:bCs/>
+              </w:rPr>
+            </w:pPr>
+            <w:r>
+              <w:rPr>
+                <w:b/>
+                <w:bCs/>
+              </w:rPr>
+              <w:t>Request (Standard)</w:t>
+            </w:r>
+          </w:p>
+        </w:tc>
+        <w:tc>
+          <w:tcPr>
+            <w:tcW w:w="0" w:type="auto"/>
+            <w:vAlign w:val="center"/>
+            <w:hideMark/>
+          </w:tcPr>
+          <w:p>
+            <w:pPr>
+              <w:rPr>
+                <w:b/>
+                <w:bCs/>
+              </w:rPr>
+            </w:pPr>
+            <w:r>
+              <w:rPr>
+                <w:b/>
+                <w:bCs/>
+              </w:rPr>
+              <w:t>NextRequest (Next.js)</w:t>
+            </w:r>
+          </w:p>
+        </w:tc>
+      </w:tr>
+      <w:tr>
+        <w:trPr>
+          <w:tblCellSpacing w:w="15" w:type="dxa"/>
+        </w:trPr>
+        <w:tc>
+          <w:tcPr>
+            <w:tcW w:w="0" w:type="auto"/>
+            <w:vAlign w:val="center"/>
+            <w:hideMark/>
+          </w:tcPr>
+          <w:p>
+            <w:r>
+              <w:t>Origin</w:t>
+            </w:r>
+          </w:p>
+        </w:tc>
+        <w:tc>
+          <w:tcPr>
+            <w:tcW w:w="0" w:type="auto"/>
+            <w:vAlign w:val="center"/>
+            <w:hideMark/>
+          </w:tcPr>
+          <w:p>
+            <w:r>
+              <w:t>Web API</w:t>
+            </w:r>
+          </w:p>
+        </w:tc>
+        <w:tc>
+          <w:tcPr>
+            <w:tcW w:w="0" w:type="auto"/>
+            <w:vAlign w:val="center"/>
+            <w:hideMark/>
+          </w:tcPr>
+          <w:p>
+            <w:r>
+              <w:t>Next.js</w:t>
+            </w:r>
+          </w:p>
+        </w:tc>
+      </w:tr>
+      <w:tr>
+        <w:trPr>
+          <w:tblCellSpacing w:w="15" w:type="dxa"/>
+        </w:trPr>
+        <w:tc>
+          <w:tcPr>
+            <w:tcW w:w="0" w:type="auto"/>
+            <w:vAlign w:val="center"/>
+            <w:hideMark/>
+          </w:tcPr>
+          <w:p>
+            <w:r>
+              <w:t>URL parsing</w:t>
+            </w:r>
+          </w:p>
+        </w:tc>
+        <w:tc>
+          <w:tcPr>
+            <w:tcW w:w="0" w:type="auto"/>
+            <w:vAlign w:val="center"/>
+            <w:hideMark/>
+          </w:tcPr>
+          <w:p>
+            <w:r>
+              <w:t>Manual (new URL)</w:t>
+            </w:r>
+          </w:p>
+        </w:tc>
+        <w:tc>
+          <w:tcPr>
+            <w:tcW w:w="0" w:type="auto"/>
+            <w:vAlign w:val="center"/>
+            <w:hideMark/>
+          </w:tcPr>
+          <w:p>
+            <w:proofErr w:type="spellStart"/>
+            <w:r>
+              <w:t>nextUrl</w:t>
+            </w:r>
+            <w:proofErr w:type="spellEnd"/>
+            <w:r>
+              <w:t xml:space="preserve"> built-in</w:t>
+            </w:r>
+          </w:p>
+        </w:tc>
+      </w:tr>
+      <w:tr>
+        <w:trPr>
+          <w:tblCellSpacing w:w="15" w:type="dxa"/>
+        </w:trPr>
+        <w:tc>
+          <w:tcPr>
+            <w:tcW w:w="0" w:type="auto"/>
+            <w:vAlign w:val="center"/>
+            <w:hideMark/>
+          </w:tcPr>
+          <w:p>
+            <w:r>
+              <w:t>Cookies</w:t>
+            </w:r>
+          </w:p>
+        </w:tc>
+        <w:tc>
+          <w:tcPr>
+            <w:tcW w:w="0" w:type="auto"/>
+            <w:vAlign w:val="center"/>
+            <w:hideMark/>
+          </w:tcPr>
+          <w:p>
+            <w:r>
+              <w:t>Manual parsing</w:t>
+            </w:r>
+          </w:p>
+        </w:tc>
+        <w:tc>
+          <w:tcPr>
+            <w:tcW w:w="0" w:type="auto"/>
+            <w:vAlign w:val="center"/>
+            <w:hideMark/>
+          </w:tcPr>
+          <w:p>
+            <w:proofErr w:type="spellStart"/>
+            <w:proofErr w:type="gramStart"/>
+            <w:r>
+              <w:t>request.cookies</w:t>
+            </w:r>
+            <w:proofErr w:type="spellEnd"/>
+            <w:proofErr w:type="gramEnd"/>
+          </w:p>
+        </w:tc>
+      </w:tr>
+      <w:tr>
+        <w:trPr>
+          <w:tblCellSpacing w:w="15" w:type="dxa"/>
+        </w:trPr>
+        <w:tc>
+          <w:tcPr>
+            <w:tcW w:w="0" w:type="auto"/>
+            <w:vAlign w:val="center"/>
+            <w:hideMark/>
+          </w:tcPr>
+          <w:p>
+            <w:r>
+              <w:lastRenderedPageBreak/>
+              <w:t>Middleware use</w:t>
+            </w:r>
+          </w:p>
+        </w:tc>
+        <w:tc>
+          <w:tcPr>
+            <w:tcW w:w="0" w:type="auto"/>
+            <w:vAlign w:val="center"/>
+            <w:hideMark/>
+          </w:tcPr>
+          <w:p>
+            <w:r>
+              <w:rPr>
+                <w:rFonts w:ascii="Segoe UI Emoji" w:hAnsi="Segoe UI Emoji" w:cs="Segoe UI Emoji"/>
+              </w:rPr>
+              <w:t>❌</w:t>
+            </w:r>
+          </w:p>
+        </w:tc>
+        <w:tc>
+          <w:tcPr>
+            <w:tcW w:w="0" w:type="auto"/>
+            <w:vAlign w:val="center"/>
+            <w:hideMark/>
+          </w:tcPr>
+          <w:p>
+            <w:r>
+              <w:rPr>
+                <w:rFonts w:ascii="Segoe UI Emoji" w:hAnsi="Segoe UI Emoji" w:cs="Segoe UI Emoji"/>
+              </w:rPr>
+              <w:t>✅</w:t>
+            </w:r>
+          </w:p>
+        </w:tc>
+      </w:tr>
+      <w:tr>
+        <w:trPr>
+          <w:tblCellSpacing w:w="15" w:type="dxa"/>
+        </w:trPr>
+        <w:tc>
+          <w:tcPr>
+            <w:tcW w:w="0" w:type="auto"/>
+            <w:vAlign w:val="center"/>
+            <w:hideMark/>
+          </w:tcPr>
+          <w:p>
+            <w:r>
+              <w:t>Extra metadata</w:t>
+            </w:r>
+          </w:p>
+        </w:tc>
+        <w:tc>
+          <w:tcPr>
+            <w:tcW w:w="0" w:type="auto"/>
+            <w:vAlign w:val="center"/>
+            <w:hideMark/>
+          </w:tcPr>
+          <w:p>
+            <w:r>
+              <w:rPr>
+                <w:rFonts w:ascii="Segoe UI Emoji" w:hAnsi="Segoe UI Emoji" w:cs="Segoe UI Emoji"/>
+              </w:rPr>
+              <w:t>❌</w:t>
+            </w:r>
+          </w:p>
+        </w:tc>
+        <w:tc>
+          <w:tcPr>
+            <w:tcW w:w="0" w:type="auto"/>
+            <w:vAlign w:val="center"/>
+            <w:hideMark/>
+          </w:tcPr>
+          <w:p>
+            <w:r>
+              <w:rPr>
+                <w:rFonts w:ascii="Segoe UI Emoji" w:hAnsi="Segoe UI Emoji" w:cs="Segoe UI Emoji"/>
+              </w:rPr>
+              <w:t>✅</w:t>
+            </w:r>
+            <w:r>
+              <w:t xml:space="preserve"> (IP, geo, etc.)</w:t>
+            </w:r>
+          </w:p>
+        </w:tc>
+      </w:tr>
+    </w:tbl>
+    <w:p>
+      <w:r>
+        <w:pict w14:anchorId="0138C02B">
+          <v:rect id="_x0000_i1104" style="width:0;height:1.5pt" o:hralign="center" o:hrstd="t" o:hr="t" fillcolor="#a0a0a0" stroked="f"/>
+        </w:pict>
+      </w:r>
+    </w:p>
+    <w:p>
+      <w:pPr>
+        <w:rPr>
+          <w:b/>
+          <w:bCs/>
+        </w:rPr>
+      </w:pPr>
+      <w:r>
+        <w:rPr>
+          <w:rFonts w:ascii="Segoe UI Emoji" w:hAnsi="Segoe UI Emoji" w:cs="Segoe UI Emoji"/>
+          <w:b/>
+          <w:bCs/>
+        </w:rPr>
+        <w:t>🧠</w:t>
+      </w:r>
+      <w:r>
+        <w:rPr>
+          <w:b/>
+          <w:bCs/>
+        </w:rPr>
+        <w:t xml:space="preserve"> When to Use What?</w:t>
+      </w:r>
+    </w:p>
+    <w:p>
+      <w:pPr>
+        <w:rPr>
+          <w:b/>
+          <w:bCs/>
+        </w:rPr>
+      </w:pPr>
+      <w:r>
+        <w:rPr>
+          <w:rFonts w:ascii="Segoe UI Emoji" w:hAnsi="Segoe UI Emoji" w:cs="Segoe UI Emoji"/>
+          <w:b/>
+          <w:bCs/>
+        </w:rPr>
+        <w:t>👉</w:t>
+      </w:r>
+      <w:r>
+        <w:rPr>
+          <w:b/>
+          <w:bCs/>
+        </w:rPr>
+        <w:t xml:space="preserve"> Use Request when:</w:t>
+      </w:r>
+    </w:p>
+    <w:p>
+      <w:pPr>
+        <w:numPr>
+          <w:ilvl w:val="0"/>
+          <w:numId w:val="6"/>
+        </w:numPr>
+      </w:pPr>
+      <w:r>
+        <w:t xml:space="preserve">You want </w:t>
+      </w:r>
+      <w:r>
+        <w:rPr>
+          <w:b/>
+          <w:bCs/>
+        </w:rPr>
+        <w:t>standard, portable code</w:t>
+      </w:r>
+    </w:p>
+    <w:p>
+      <w:pPr>
+        <w:numPr>
+          <w:ilvl w:val="0"/>
+          <w:numId w:val="6"/>
+        </w:numPr>
+      </w:pPr>
+      <w:r>
+        <w:t>You don’t need Next.js-specific features</w:t>
+      </w:r>
+    </w:p>
+    <w:p>
+      <w:pPr>
+        <w:numPr>
+          <w:ilvl w:val="0"/>
+          <w:numId w:val="6"/>
+        </w:numPr>
+      </w:pPr>
+      <w:r>
+        <w:t>Simple APIs (POST, PUT, etc.)</w:t>
+      </w:r>
+    </w:p>
+    <w:p>
+      <w:r>
+        <w:pict w14:anchorId="7930DFEC">
+          <v:rect id="_x0000_i1105" style="width:0;height:1.5pt" o:hralign="center" o:hrstd="t" o:hr="t" fillcolor="#a0a0a0" stroked="f"/>
+        </w:pict>
+      </w:r>
+    </w:p>
+    <w:p>
+      <w:pPr>
+        <w:rPr>
+          <w:b/>
+          <w:bCs/>
+        </w:rPr>
+      </w:pPr>
+      <w:r>
+        <w:rPr>
+          <w:rFonts w:ascii="Segoe UI Emoji" w:hAnsi="Segoe UI Emoji" w:cs="Segoe UI Emoji"/>
+          <w:b/>
+          <w:bCs/>
+        </w:rPr>
+        <w:t>👉</w:t>
+      </w:r>
+      <w:r>
+        <w:rPr>
+          <w:b/>
+          <w:bCs/>
+        </w:rPr>
+        <w:t xml:space="preserve"> Use NextRequest when:</w:t>
+      </w:r>
+    </w:p>
+    <w:p>
+      <w:pPr>
+        <w:numPr>
+          <w:ilvl w:val="0"/>
+          <w:numId w:val="7"/>
+        </w:numPr>
+      </w:pPr>
+      <w:r>
+        <w:t>You need:</w:t>
+      </w:r>
+    </w:p>
+    <w:p>
+      <w:pPr>
+        <w:numPr>
+          <w:ilvl w:val="1"/>
+          <w:numId w:val="7"/>
+        </w:numPr>
+      </w:pPr>
+      <w:r>
+        <w:t>query params (</w:t>
+      </w:r>
+      <w:proofErr w:type="spellStart"/>
+      <w:r>
+        <w:t>nextUrl</w:t>
+      </w:r>
+      <w:proofErr w:type="spellEnd"/>
+      <w:r>
+        <w:t>)</w:t>
+      </w:r>
+    </w:p>
+    <w:p>
+      <w:pPr>
+        <w:numPr>
+          <w:ilvl w:val="1"/>
+          <w:numId w:val="7"/>
+        </w:numPr>
+      </w:pPr>
+      <w:r>
+        <w:t>cookies</w:t>
+      </w:r>
+    </w:p>
+    <w:p>
+      <w:pPr>
+        <w:numPr>
+          <w:ilvl w:val="1"/>
+          <w:numId w:val="7"/>
+        </w:numPr>
+      </w:pPr>
+      <w:r>
+        <w:t>middleware features</w:t>
+      </w:r>
+    </w:p>
+    <w:p>
+      <w:pPr>
+        <w:numPr>
+          <w:ilvl w:val="0"/>
+          <w:numId w:val="7"/>
+        </w:numPr>
+      </w:pPr>
+      <w:r>
+        <w:t xml:space="preserve">You're working deeply with </w:t>
+      </w:r>
+      <w:r>
+        <w:rPr>
+          <w:b/>
+          <w:bCs/>
+        </w:rPr>
+        <w:t>Next.js routing/middleware</w:t>
+      </w:r>
+    </w:p>
+    <w:p>
+      <w:r>
+        <w:pict w14:anchorId="630B6AAD">
+          <v:rect id="_x0000_i1106" style="width:0;height:1.5pt" o:hralign="center" o:hrstd="t" o:hr="t" fillcolor="#a0a0a0" stroked="f"/>
+        </w:pict>
+      </w:r>
+    </w:p>
+    <w:p>
+      <w:pPr>
+        <w:rPr>
+          <w:b/>
+          <w:bCs/>
+        </w:rPr>
+      </w:pPr>
+      <w:r>
+        <w:rPr>
+          <w:rFonts w:ascii="Segoe UI Emoji" w:hAnsi="Segoe UI Emoji" w:cs="Segoe UI Emoji"/>
+          <w:b/>
+          <w:bCs/>
+        </w:rPr>
+        <w:t>⚠️</w:t>
+      </w:r>
+      <w:r>
+        <w:rPr>
+          <w:b/>
+          <w:bCs/>
+        </w:rPr>
+        <w:t xml:space="preserve"> One More Important Thing</w:t>
+      </w:r>
+    </w:p>
+    <w:p>
+      <w:r>
+        <w:t>You can actually use both in Next.js route handlers:</w:t>
+      </w:r>
+    </w:p>
+    <w:p>
+      <w:r>
+        <w:t xml:space="preserve">export async function </w:t>
+      </w:r>
+      <w:proofErr w:type="gramStart"/>
+      <w:r>
+        <w:t>POST(</w:t>
+      </w:r>
+      <w:proofErr w:type="gramEnd"/>
+      <w:r>
+        <w:t>request: Request) {}</w:t>
+      </w:r>
+    </w:p>
+    <w:p>
+      <w:r>
+        <w:t xml:space="preserve">export function </w:t>
+      </w:r>
+      <w:proofErr w:type="gramStart"/>
+      <w:r>
+        <w:t>GET(</w:t>
+      </w:r>
+      <w:proofErr w:type="gramEnd"/>
+      <w:r>
+        <w:t>request: NextRequest) {}</w:t>
+      </w:r>
+    </w:p>
+    <w:p>
+      <w:r>
+        <w:rPr>
+          <w:rFonts w:ascii="Segoe UI Emoji" w:hAnsi="Segoe UI Emoji" w:cs="Segoe UI Emoji"/>
+        </w:rPr>
+        <w:t>✔️</w:t>
+      </w:r>
+      <w:r>
+        <w:t xml:space="preserve"> Both work — choice depends on your needs.</w:t>
+      </w:r>
+    </w:p>
+    <w:p>
+      <w:r>
+        <w:pict w14:anchorId="480863A9">
+          <v:rect id="_x0000_i1107" style="width:0;height:1.5pt" o:hralign="center" o:hrstd="t" o:hr="t" fillcolor="#a0a0a0" stroked="f"/>
+        </w:pict>
+      </w:r>
+    </w:p>
+    <w:p>
+      <w:pPr>
+        <w:rPr>
+          <w:b/>
+          <w:bCs/>
+        </w:rPr>
+      </w:pPr>
+      <w:r>
+        <w:rPr>
+          <w:rFonts w:ascii="Segoe UI Emoji" w:hAnsi="Segoe UI Emoji" w:cs="Segoe UI Emoji"/>
+          <w:b/>
+          <w:bCs/>
+        </w:rPr>
+        <w:t>✅</w:t>
+      </w:r>
+      <w:r>
+        <w:rPr>
+          <w:b/>
+          <w:bCs/>
+        </w:rPr>
+        <w:t xml:space="preserve"> Simple Rule</w:t>
+      </w:r>
+    </w:p>
+    <w:p>
+      <w:r>
+        <w:t xml:space="preserve">If you need </w:t>
+      </w:r>
+      <w:r>
+        <w:rPr>
+          <w:b/>
+          <w:bCs/>
+        </w:rPr>
+        <w:t>Next.js magic → use NextRequest</w:t>
+      </w:r>
+      <w:r>
+        <w:br/>
+        <w:t xml:space="preserve">If you need </w:t>
+      </w:r>
+      <w:r>
+        <w:rPr>
+          <w:b/>
+          <w:bCs/>
+        </w:rPr>
+        <w:t>simple API handling → use Request</w:t>
+      </w:r>
+    </w:p>
+    <w:p>
+      <w:r>
+        <w:pict w14:anchorId="04E42B0E">
+          <v:rect id="_x0000_i1108" style="width:0;height:1.5pt" o:hralign="center" o:hrstd="t" o:hr="t" fillcolor="#a0a0a0" stroked="f"/>
+        </w:pict>
+      </w:r>
+    </w:p>
+    <w:p>
+      <w:r>
+        <w:t>If you want, I can also show:</w:t>
+      </w:r>
+    </w:p>
+    <w:p>
+      <w:pPr>
+        <w:numPr>
+          <w:ilvl w:val="0"/>
+          <w:numId w:val="8"/>
+        </w:numPr>
+      </w:pPr>
+      <w:proofErr w:type="spellStart"/>
+      <w:r>
+        <w:t>NextResponse</w:t>
+      </w:r>
+      <w:proofErr w:type="spellEnd"/>
+      <w:r>
+        <w:t xml:space="preserve"> vs Response</w:t>
+      </w:r>
+    </w:p>
+    <w:p>
+      <w:pPr>
+        <w:numPr>
+          <w:ilvl w:val="0"/>
+          <w:numId w:val="8"/>
+        </w:numPr>
+      </w:pPr>
+      <w:r>
+        <w:lastRenderedPageBreak/>
+        <w:t xml:space="preserve">or a real-world auth example using cookies </w:t>
+      </w:r>
+      <w:r>
+        <w:rPr>
+          <w:rFonts w:ascii="Segoe UI Emoji" w:hAnsi="Segoe UI Emoji" w:cs="Segoe UI Emoji"/>
+        </w:rPr>
+        <w:t>🔐</w:t>
+      </w:r>
+    </w:p>
+    <w:p>
+      <w:pPr>
+        <w:rPr>
+          <w:lang w:val="en-US"/>
+        </w:rPr>
+      </w:pPr>
+    </w:p>
+    <w:p>
+      <w:pPr>
+        <w:rPr>
+          <w:lang w:val="en-US"/>
+        </w:rPr>
+      </w:pPr>
+    </w:p>
+    <w:p>
+      <w:pPr>
+        <w:rPr>
+          <w:lang w:val="en-US"/>
+        </w:rPr>
+      </w:pPr>
+    </w:p>
+    <w:p>
+      <w:pPr>
         <w:rPr>
           <w:lang w:val="en-US"/>
         </w:rPr>
@@ -1554,6 +3071,453 @@
 <file path=word/numbering.xml><?xml version="1.0" encoding="utf-8"?>
 <w:numbering xmlns:wpc="http://schemas.microsoft.com/office/word/2010/wordprocessingCanvas" xmlns:cx="http://schemas.microsoft.com/office/drawing/2014/chartex" xmlns:cx1="http://schemas.microsoft.com/office/drawing/2015/9/8/chartex" xmlns:cx2="http://schemas.microsoft.com/office/drawing/2015/10/21/chartex" xmlns:cx3="http://schemas.microsoft.com/office/drawing/2016/5/9/chartex" xmlns:cx4="http://schemas.microsoft.com/office/drawing/2016/5/10/chartex" xmlns:cx5="http://schemas.microsoft.com/office/drawing/2016/5/11/chartex" xmlns:cx6="http://schemas.microsoft.com/office/drawing/2016/5/12/chartex" xmlns:cx7="http://schemas.microsoft.com/office/drawing/2016/5/13/chartex" xmlns:cx8="http://schemas.microsoft.com/office/drawing/2016/5/14/chartex" xmlns:mc="http://schemas.openxmlformats.org/markup-compatibility/2006" xmlns:aink="http://schemas.microsoft.com/office/drawing/2016/ink" xmlns:am3d="http://schemas.microsoft.com/office/drawing/2017/model3d" xmlns:o="urn:schemas-microsoft-com:office:office" xmlns:oel="http://schemas.microsoft.com/office/2019/extlst" xmlns:r="http://schemas.openxmlformats.org/officeDocument/2006/relationships" xmlns:m="http://schemas.openxmlformats.org/officeDocument/2006/math" xmlns:v="urn:schemas-microsoft-com:vml" xmlns:wp14="http://schemas.microsoft.com/office/word/2010/wordprocessingDrawing" xmlns:wp="http://schemas.openxmlformats.org/drawingml/2006/wordprocessingDrawing" xmlns:w10="urn:schemas-microsoft-com:office:word" xmlns:w="http://schemas.openxmlformats.org/wordprocessingml/2006/main" xmlns:w14="http://schemas.microsoft.com/office/word/2010/wordml" xmlns:w15="http://schemas.microsoft.com/office/word/2012/wordml" xmlns:w16cex="http://schemas.microsoft.com/office/word/2018/wordml/cex" xmlns:w16cid="http://schemas.microsoft.com/office/word/2016/wordml/cid" xmlns:w16="http://schemas.microsoft.com/office/word/2018/wordml" xmlns:w16du="http://schemas.microsoft.com/office/word/2023/wordml/word16du" xmlns:w16sdtdh="http://schemas.microsoft.com/office/word/2020/wordml/sdtdatahash" xmlns:w16sdtfl="http://schemas.microsoft.com/office/word/2024/wordml/sdtformatlock" xmlns:w16se="http://schemas.microsoft.com/office/word/2015/wordml/symex" xmlns:wpg="http://schemas.microsoft.com/office/word/2010/wordprocessingGroup" xmlns:wpi="http://schemas.microsoft.com/office/word/2010/wordprocessingInk" xmlns:wne="http://schemas.microsoft.com/office/word/2006/wordml" xmlns:wps="http://schemas.microsoft.com/office/word/2010/wordprocessingShape" mc:Ignorable="w14 w15 w16se w16cid w16 w16cex w16sdtdh w16sdtfl w16du wp14">
   <w:abstractNum w:abstractNumId="0" w15:restartNumberingAfterBreak="0">
+    <w:nsid w:val="21D81EB1"/>
+    <w:multiLevelType w:val="multilevel"/>
+    <w:tmpl w:val="5D560F14"/>
+    <w:lvl w:ilvl="0">
+      <w:start w:val="1"/>
+      <w:numFmt w:val="bullet"/>
+      <w:lvlText w:val=""/>
+      <w:lvlJc w:val="left"/>
+      <w:pPr>
+        <w:tabs>
+          <w:tab w:val="num" w:pos="720"/>
+        </w:tabs>
+        <w:ind w:left="720" w:hanging="360"/>
+      </w:pPr>
+      <w:rPr>
+        <w:rFonts w:ascii="Symbol" w:hAnsi="Symbol" w:hint="default"/>
+        <w:sz w:val="20"/>
+      </w:rPr>
+    </w:lvl>
+    <w:lvl w:ilvl="1" w:tentative="1">
+      <w:start w:val="1"/>
+      <w:numFmt w:val="bullet"/>
+      <w:lvlText w:val="o"/>
+      <w:lvlJc w:val="left"/>
+      <w:pPr>
+        <w:tabs>
+          <w:tab w:val="num" w:pos="1440"/>
+        </w:tabs>
+        <w:ind w:left="1440" w:hanging="360"/>
+      </w:pPr>
+      <w:rPr>
+        <w:rFonts w:ascii="Courier New" w:hAnsi="Courier New" w:hint="default"/>
+        <w:sz w:val="20"/>
+      </w:rPr>
+    </w:lvl>
+    <w:lvl w:ilvl="2" w:tentative="1">
+      <w:start w:val="1"/>
+      <w:numFmt w:val="bullet"/>
+      <w:lvlText w:val=""/>
+      <w:lvlJc w:val="left"/>
+      <w:pPr>
+        <w:tabs>
+          <w:tab w:val="num" w:pos="2160"/>
+        </w:tabs>
+        <w:ind w:left="2160" w:hanging="360"/>
+      </w:pPr>
+      <w:rPr>
+        <w:rFonts w:ascii="Wingdings" w:hAnsi="Wingdings" w:hint="default"/>
+        <w:sz w:val="20"/>
+      </w:rPr>
+    </w:lvl>
+    <w:lvl w:ilvl="3" w:tentative="1">
+      <w:start w:val="1"/>
+      <w:numFmt w:val="bullet"/>
+      <w:lvlText w:val=""/>
+      <w:lvlJc w:val="left"/>
+      <w:pPr>
+        <w:tabs>
+          <w:tab w:val="num" w:pos="2880"/>
+        </w:tabs>
+        <w:ind w:left="2880" w:hanging="360"/>
+      </w:pPr>
+      <w:rPr>
+        <w:rFonts w:ascii="Wingdings" w:hAnsi="Wingdings" w:hint="default"/>
+        <w:sz w:val="20"/>
+      </w:rPr>
+    </w:lvl>
+    <w:lvl w:ilvl="4" w:tentative="1">
+      <w:start w:val="1"/>
+      <w:numFmt w:val="bullet"/>
+      <w:lvlText w:val=""/>
+      <w:lvlJc w:val="left"/>
+      <w:pPr>
+        <w:tabs>
+          <w:tab w:val="num" w:pos="3600"/>
+        </w:tabs>
+        <w:ind w:left="3600" w:hanging="360"/>
+      </w:pPr>
+      <w:rPr>
+        <w:rFonts w:ascii="Wingdings" w:hAnsi="Wingdings" w:hint="default"/>
+        <w:sz w:val="20"/>
+      </w:rPr>
+    </w:lvl>
+    <w:lvl w:ilvl="5" w:tentative="1">
+      <w:start w:val="1"/>
+      <w:numFmt w:val="bullet"/>
+      <w:lvlText w:val=""/>
+      <w:lvlJc w:val="left"/>
+      <w:pPr>
+        <w:tabs>
+          <w:tab w:val="num" w:pos="4320"/>
+        </w:tabs>
+        <w:ind w:left="4320" w:hanging="360"/>
+      </w:pPr>
+      <w:rPr>
+        <w:rFonts w:ascii="Wingdings" w:hAnsi="Wingdings" w:hint="default"/>
+        <w:sz w:val="20"/>
+      </w:rPr>
+    </w:lvl>
+    <w:lvl w:ilvl="6" w:tentative="1">
+      <w:start w:val="1"/>
+      <w:numFmt w:val="bullet"/>
+      <w:lvlText w:val=""/>
+      <w:lvlJc w:val="left"/>
+      <w:pPr>
+        <w:tabs>
+          <w:tab w:val="num" w:pos="5040"/>
+        </w:tabs>
+        <w:ind w:left="5040" w:hanging="360"/>
+      </w:pPr>
+      <w:rPr>
+        <w:rFonts w:ascii="Wingdings" w:hAnsi="Wingdings" w:hint="default"/>
+        <w:sz w:val="20"/>
+      </w:rPr>
+    </w:lvl>
+    <w:lvl w:ilvl="7" w:tentative="1">
+      <w:start w:val="1"/>
+      <w:numFmt w:val="bullet"/>
+      <w:lvlText w:val=""/>
+      <w:lvlJc w:val="left"/>
+      <w:pPr>
+        <w:tabs>
+          <w:tab w:val="num" w:pos="5760"/>
+        </w:tabs>
+        <w:ind w:left="5760" w:hanging="360"/>
+      </w:pPr>
+      <w:rPr>
+        <w:rFonts w:ascii="Wingdings" w:hAnsi="Wingdings" w:hint="default"/>
+        <w:sz w:val="20"/>
+      </w:rPr>
+    </w:lvl>
+    <w:lvl w:ilvl="8" w:tentative="1">
+      <w:start w:val="1"/>
+      <w:numFmt w:val="bullet"/>
+      <w:lvlText w:val=""/>
+      <w:lvlJc w:val="left"/>
+      <w:pPr>
+        <w:tabs>
+          <w:tab w:val="num" w:pos="6480"/>
+        </w:tabs>
+        <w:ind w:left="6480" w:hanging="360"/>
+      </w:pPr>
+      <w:rPr>
+        <w:rFonts w:ascii="Wingdings" w:hAnsi="Wingdings" w:hint="default"/>
+        <w:sz w:val="20"/>
+      </w:rPr>
+    </w:lvl>
+  </w:abstractNum>
+  <w:abstractNum w:abstractNumId="1" w15:restartNumberingAfterBreak="0">
+    <w:nsid w:val="27092B28"/>
+    <w:multiLevelType w:val="multilevel"/>
+    <w:tmpl w:val="C2B643E6"/>
+    <w:lvl w:ilvl="0">
+      <w:start w:val="1"/>
+      <w:numFmt w:val="bullet"/>
+      <w:lvlText w:val=""/>
+      <w:lvlJc w:val="left"/>
+      <w:pPr>
+        <w:tabs>
+          <w:tab w:val="num" w:pos="720"/>
+        </w:tabs>
+        <w:ind w:left="720" w:hanging="360"/>
+      </w:pPr>
+      <w:rPr>
+        <w:rFonts w:ascii="Symbol" w:hAnsi="Symbol" w:hint="default"/>
+        <w:sz w:val="20"/>
+      </w:rPr>
+    </w:lvl>
+    <w:lvl w:ilvl="1" w:tentative="1">
+      <w:start w:val="1"/>
+      <w:numFmt w:val="bullet"/>
+      <w:lvlText w:val="o"/>
+      <w:lvlJc w:val="left"/>
+      <w:pPr>
+        <w:tabs>
+          <w:tab w:val="num" w:pos="1440"/>
+        </w:tabs>
+        <w:ind w:left="1440" w:hanging="360"/>
+      </w:pPr>
+      <w:rPr>
+        <w:rFonts w:ascii="Courier New" w:hAnsi="Courier New" w:hint="default"/>
+        <w:sz w:val="20"/>
+      </w:rPr>
+    </w:lvl>
+    <w:lvl w:ilvl="2" w:tentative="1">
+      <w:start w:val="1"/>
+      <w:numFmt w:val="bullet"/>
+      <w:lvlText w:val=""/>
+      <w:lvlJc w:val="left"/>
+      <w:pPr>
+        <w:tabs>
+          <w:tab w:val="num" w:pos="2160"/>
+        </w:tabs>
+        <w:ind w:left="2160" w:hanging="360"/>
+      </w:pPr>
+      <w:rPr>
+        <w:rFonts w:ascii="Wingdings" w:hAnsi="Wingdings" w:hint="default"/>
+        <w:sz w:val="20"/>
+      </w:rPr>
+    </w:lvl>
+    <w:lvl w:ilvl="3" w:tentative="1">
+      <w:start w:val="1"/>
+      <w:numFmt w:val="bullet"/>
+      <w:lvlText w:val=""/>
+      <w:lvlJc w:val="left"/>
+      <w:pPr>
+        <w:tabs>
+          <w:tab w:val="num" w:pos="2880"/>
+        </w:tabs>
+        <w:ind w:left="2880" w:hanging="360"/>
+      </w:pPr>
+      <w:rPr>
+        <w:rFonts w:ascii="Wingdings" w:hAnsi="Wingdings" w:hint="default"/>
+        <w:sz w:val="20"/>
+      </w:rPr>
+    </w:lvl>
+    <w:lvl w:ilvl="4" w:tentative="1">
+      <w:start w:val="1"/>
+      <w:numFmt w:val="bullet"/>
+      <w:lvlText w:val=""/>
+      <w:lvlJc w:val="left"/>
+      <w:pPr>
+        <w:tabs>
+          <w:tab w:val="num" w:pos="3600"/>
+        </w:tabs>
+        <w:ind w:left="3600" w:hanging="360"/>
+      </w:pPr>
+      <w:rPr>
+        <w:rFonts w:ascii="Wingdings" w:hAnsi="Wingdings" w:hint="default"/>
+        <w:sz w:val="20"/>
+      </w:rPr>
+    </w:lvl>
+    <w:lvl w:ilvl="5" w:tentative="1">
+      <w:start w:val="1"/>
+      <w:numFmt w:val="bullet"/>
+      <w:lvlText w:val=""/>
+      <w:lvlJc w:val="left"/>
+      <w:pPr>
+        <w:tabs>
+          <w:tab w:val="num" w:pos="4320"/>
+        </w:tabs>
+        <w:ind w:left="4320" w:hanging="360"/>
+      </w:pPr>
+      <w:rPr>
+        <w:rFonts w:ascii="Wingdings" w:hAnsi="Wingdings" w:hint="default"/>
+        <w:sz w:val="20"/>
+      </w:rPr>
+    </w:lvl>
+    <w:lvl w:ilvl="6" w:tentative="1">
+      <w:start w:val="1"/>
+      <w:numFmt w:val="bullet"/>
+      <w:lvlText w:val=""/>
+      <w:lvlJc w:val="left"/>
+      <w:pPr>
+        <w:tabs>
+          <w:tab w:val="num" w:pos="5040"/>
+        </w:tabs>
+        <w:ind w:left="5040" w:hanging="360"/>
+      </w:pPr>
+      <w:rPr>
+        <w:rFonts w:ascii="Wingdings" w:hAnsi="Wingdings" w:hint="default"/>
+        <w:sz w:val="20"/>
+      </w:rPr>
+    </w:lvl>
+    <w:lvl w:ilvl="7" w:tentative="1">
+      <w:start w:val="1"/>
+      <w:numFmt w:val="bullet"/>
+      <w:lvlText w:val=""/>
+      <w:lvlJc w:val="left"/>
+      <w:pPr>
+        <w:tabs>
+          <w:tab w:val="num" w:pos="5760"/>
+        </w:tabs>
+        <w:ind w:left="5760" w:hanging="360"/>
+      </w:pPr>
+      <w:rPr>
+        <w:rFonts w:ascii="Wingdings" w:hAnsi="Wingdings" w:hint="default"/>
+        <w:sz w:val="20"/>
+      </w:rPr>
+    </w:lvl>
+    <w:lvl w:ilvl="8" w:tentative="1">
+      <w:start w:val="1"/>
+      <w:numFmt w:val="bullet"/>
+      <w:lvlText w:val=""/>
+      <w:lvlJc w:val="left"/>
+      <w:pPr>
+        <w:tabs>
+          <w:tab w:val="num" w:pos="6480"/>
+        </w:tabs>
+        <w:ind w:left="6480" w:hanging="360"/>
+      </w:pPr>
+      <w:rPr>
+        <w:rFonts w:ascii="Wingdings" w:hAnsi="Wingdings" w:hint="default"/>
+        <w:sz w:val="20"/>
+      </w:rPr>
+    </w:lvl>
+  </w:abstractNum>
+  <w:abstractNum w:abstractNumId="2" w15:restartNumberingAfterBreak="0">
+    <w:nsid w:val="3185003E"/>
+    <w:multiLevelType w:val="multilevel"/>
+    <w:tmpl w:val="E7DC7C88"/>
+    <w:lvl w:ilvl="0">
+      <w:start w:val="1"/>
+      <w:numFmt w:val="bullet"/>
+      <w:lvlText w:val=""/>
+      <w:lvlJc w:val="left"/>
+      <w:pPr>
+        <w:tabs>
+          <w:tab w:val="num" w:pos="720"/>
+        </w:tabs>
+        <w:ind w:left="720" w:hanging="360"/>
+      </w:pPr>
+      <w:rPr>
+        <w:rFonts w:ascii="Symbol" w:hAnsi="Symbol" w:hint="default"/>
+        <w:sz w:val="20"/>
+      </w:rPr>
+    </w:lvl>
+    <w:lvl w:ilvl="1" w:tentative="1">
+      <w:start w:val="1"/>
+      <w:numFmt w:val="bullet"/>
+      <w:lvlText w:val="o"/>
+      <w:lvlJc w:val="left"/>
+      <w:pPr>
+        <w:tabs>
+          <w:tab w:val="num" w:pos="1440"/>
+        </w:tabs>
+        <w:ind w:left="1440" w:hanging="360"/>
+      </w:pPr>
+      <w:rPr>
+        <w:rFonts w:ascii="Courier New" w:hAnsi="Courier New" w:hint="default"/>
+        <w:sz w:val="20"/>
+      </w:rPr>
+    </w:lvl>
+    <w:lvl w:ilvl="2" w:tentative="1">
+      <w:start w:val="1"/>
+      <w:numFmt w:val="bullet"/>
+      <w:lvlText w:val=""/>
+      <w:lvlJc w:val="left"/>
+      <w:pPr>
+        <w:tabs>
+          <w:tab w:val="num" w:pos="2160"/>
+        </w:tabs>
+        <w:ind w:left="2160" w:hanging="360"/>
+      </w:pPr>
+      <w:rPr>
+        <w:rFonts w:ascii="Wingdings" w:hAnsi="Wingdings" w:hint="default"/>
+        <w:sz w:val="20"/>
+      </w:rPr>
+    </w:lvl>
+    <w:lvl w:ilvl="3" w:tentative="1">
+      <w:start w:val="1"/>
+      <w:numFmt w:val="bullet"/>
+      <w:lvlText w:val=""/>
+      <w:lvlJc w:val="left"/>
+      <w:pPr>
+        <w:tabs>
+          <w:tab w:val="num" w:pos="2880"/>
+        </w:tabs>
+        <w:ind w:left="2880" w:hanging="360"/>
+      </w:pPr>
+      <w:rPr>
+        <w:rFonts w:ascii="Wingdings" w:hAnsi="Wingdings" w:hint="default"/>
+        <w:sz w:val="20"/>
+      </w:rPr>
+    </w:lvl>
+    <w:lvl w:ilvl="4" w:tentative="1">
+      <w:start w:val="1"/>
+      <w:numFmt w:val="bullet"/>
+      <w:lvlText w:val=""/>
+      <w:lvlJc w:val="left"/>
+      <w:pPr>
+        <w:tabs>
+          <w:tab w:val="num" w:pos="3600"/>
+        </w:tabs>
+        <w:ind w:left="3600" w:hanging="360"/>
+      </w:pPr>
+      <w:rPr>
+        <w:rFonts w:ascii="Wingdings" w:hAnsi="Wingdings" w:hint="default"/>
+        <w:sz w:val="20"/>
+      </w:rPr>
+    </w:lvl>
+    <w:lvl w:ilvl="5" w:tentative="1">
+      <w:start w:val="1"/>
+      <w:numFmt w:val="bullet"/>
+      <w:lvlText w:val=""/>
+      <w:lvlJc w:val="left"/>
+      <w:pPr>
+        <w:tabs>
+          <w:tab w:val="num" w:pos="4320"/>
+        </w:tabs>
+        <w:ind w:left="4320" w:hanging="360"/>
+      </w:pPr>
+      <w:rPr>
+        <w:rFonts w:ascii="Wingdings" w:hAnsi="Wingdings" w:hint="default"/>
+        <w:sz w:val="20"/>
+      </w:rPr>
+    </w:lvl>
+    <w:lvl w:ilvl="6" w:tentative="1">
+      <w:start w:val="1"/>
+      <w:numFmt w:val="bullet"/>
+      <w:lvlText w:val=""/>
+      <w:lvlJc w:val="left"/>
+      <w:pPr>
+        <w:tabs>
+          <w:tab w:val="num" w:pos="5040"/>
+        </w:tabs>
+        <w:ind w:left="5040" w:hanging="360"/>
+      </w:pPr>
+      <w:rPr>
+        <w:rFonts w:ascii="Wingdings" w:hAnsi="Wingdings" w:hint="default"/>
+        <w:sz w:val="20"/>
+      </w:rPr>
+    </w:lvl>
+    <w:lvl w:ilvl="7" w:tentative="1">
+      <w:start w:val="1"/>
+      <w:numFmt w:val="bullet"/>
+      <w:lvlText w:val=""/>
+      <w:lvlJc w:val="left"/>
+      <w:pPr>
+        <w:tabs>
+          <w:tab w:val="num" w:pos="5760"/>
+        </w:tabs>
+        <w:ind w:left="5760" w:hanging="360"/>
+      </w:pPr>
+      <w:rPr>
+        <w:rFonts w:ascii="Wingdings" w:hAnsi="Wingdings" w:hint="default"/>
+        <w:sz w:val="20"/>
+      </w:rPr>
+    </w:lvl>
+    <w:lvl w:ilvl="8" w:tentative="1">
+      <w:start w:val="1"/>
+      <w:numFmt w:val="bullet"/>
+      <w:lvlText w:val=""/>
+      <w:lvlJc w:val="left"/>
+      <w:pPr>
+        <w:tabs>
+          <w:tab w:val="num" w:pos="6480"/>
+        </w:tabs>
+        <w:ind w:left="6480" w:hanging="360"/>
+      </w:pPr>
+      <w:rPr>
+        <w:rFonts w:ascii="Wingdings" w:hAnsi="Wingdings" w:hint="default"/>
+        <w:sz w:val="20"/>
+      </w:rPr>
+    </w:lvl>
+  </w:abstractNum>
+  <w:abstractNum w:abstractNumId="3" w15:restartNumberingAfterBreak="0">
     <w:nsid w:val="347531D5"/>
     <w:multiLevelType w:val="multilevel"/>
     <w:tmpl w:val="FED02914"/>
@@ -1702,7 +3666,7 @@
       </w:rPr>
     </w:lvl>
   </w:abstractNum>
-  <w:abstractNum w:abstractNumId="1" w15:restartNumberingAfterBreak="0">
+  <w:abstractNum w:abstractNumId="4" w15:restartNumberingAfterBreak="0">
     <w:nsid w:val="54AB74F2"/>
     <w:multiLevelType w:val="multilevel"/>
     <w:tmpl w:val="78EECCE4"/>
@@ -1851,7 +3815,305 @@
       </w:rPr>
     </w:lvl>
   </w:abstractNum>
-  <w:abstractNum w:abstractNumId="2" w15:restartNumberingAfterBreak="0">
+  <w:abstractNum w:abstractNumId="5" w15:restartNumberingAfterBreak="0">
+    <w:nsid w:val="64DC21E2"/>
+    <w:multiLevelType w:val="multilevel"/>
+    <w:tmpl w:val="24B6A222"/>
+    <w:lvl w:ilvl="0">
+      <w:start w:val="1"/>
+      <w:numFmt w:val="bullet"/>
+      <w:lvlText w:val=""/>
+      <w:lvlJc w:val="left"/>
+      <w:pPr>
+        <w:tabs>
+          <w:tab w:val="num" w:pos="720"/>
+        </w:tabs>
+        <w:ind w:left="720" w:hanging="360"/>
+      </w:pPr>
+      <w:rPr>
+        <w:rFonts w:ascii="Symbol" w:hAnsi="Symbol" w:hint="default"/>
+        <w:sz w:val="20"/>
+      </w:rPr>
+    </w:lvl>
+    <w:lvl w:ilvl="1">
+      <w:start w:val="1"/>
+      <w:numFmt w:val="bullet"/>
+      <w:lvlText w:val="o"/>
+      <w:lvlJc w:val="left"/>
+      <w:pPr>
+        <w:tabs>
+          <w:tab w:val="num" w:pos="1440"/>
+        </w:tabs>
+        <w:ind w:left="1440" w:hanging="360"/>
+      </w:pPr>
+      <w:rPr>
+        <w:rFonts w:ascii="Courier New" w:hAnsi="Courier New" w:hint="default"/>
+        <w:sz w:val="20"/>
+      </w:rPr>
+    </w:lvl>
+    <w:lvl w:ilvl="2" w:tentative="1">
+      <w:start w:val="1"/>
+      <w:numFmt w:val="bullet"/>
+      <w:lvlText w:val=""/>
+      <w:lvlJc w:val="left"/>
+      <w:pPr>
+        <w:tabs>
+          <w:tab w:val="num" w:pos="2160"/>
+        </w:tabs>
+        <w:ind w:left="2160" w:hanging="360"/>
+      </w:pPr>
+      <w:rPr>
+        <w:rFonts w:ascii="Wingdings" w:hAnsi="Wingdings" w:hint="default"/>
+        <w:sz w:val="20"/>
+      </w:rPr>
+    </w:lvl>
+    <w:lvl w:ilvl="3" w:tentative="1">
+      <w:start w:val="1"/>
+      <w:numFmt w:val="bullet"/>
+      <w:lvlText w:val=""/>
+      <w:lvlJc w:val="left"/>
+      <w:pPr>
+        <w:tabs>
+          <w:tab w:val="num" w:pos="2880"/>
+        </w:tabs>
+        <w:ind w:left="2880" w:hanging="360"/>
+      </w:pPr>
+      <w:rPr>
+        <w:rFonts w:ascii="Wingdings" w:hAnsi="Wingdings" w:hint="default"/>
+        <w:sz w:val="20"/>
+      </w:rPr>
+    </w:lvl>
+    <w:lvl w:ilvl="4" w:tentative="1">
+      <w:start w:val="1"/>
+      <w:numFmt w:val="bullet"/>
+      <w:lvlText w:val=""/>
+      <w:lvlJc w:val="left"/>
+      <w:pPr>
+        <w:tabs>
+          <w:tab w:val="num" w:pos="3600"/>
+        </w:tabs>
+        <w:ind w:left="3600" w:hanging="360"/>
+      </w:pPr>
+      <w:rPr>
+        <w:rFonts w:ascii="Wingdings" w:hAnsi="Wingdings" w:hint="default"/>
+        <w:sz w:val="20"/>
+      </w:rPr>
+    </w:lvl>
+    <w:lvl w:ilvl="5" w:tentative="1">
+      <w:start w:val="1"/>
+      <w:numFmt w:val="bullet"/>
+      <w:lvlText w:val=""/>
+      <w:lvlJc w:val="left"/>
+      <w:pPr>
+        <w:tabs>
+          <w:tab w:val="num" w:pos="4320"/>
+        </w:tabs>
+        <w:ind w:left="4320" w:hanging="360"/>
+      </w:pPr>
+      <w:rPr>
+        <w:rFonts w:ascii="Wingdings" w:hAnsi="Wingdings" w:hint="default"/>
+        <w:sz w:val="20"/>
+      </w:rPr>
+    </w:lvl>
+    <w:lvl w:ilvl="6" w:tentative="1">
+      <w:start w:val="1"/>
+      <w:numFmt w:val="bullet"/>
+      <w:lvlText w:val=""/>
+      <w:lvlJc w:val="left"/>
+      <w:pPr>
+        <w:tabs>
+          <w:tab w:val="num" w:pos="5040"/>
+        </w:tabs>
+        <w:ind w:left="5040" w:hanging="360"/>
+      </w:pPr>
+      <w:rPr>
+        <w:rFonts w:ascii="Wingdings" w:hAnsi="Wingdings" w:hint="default"/>
+        <w:sz w:val="20"/>
+      </w:rPr>
+    </w:lvl>
+    <w:lvl w:ilvl="7" w:tentative="1">
+      <w:start w:val="1"/>
+      <w:numFmt w:val="bullet"/>
+      <w:lvlText w:val=""/>
+      <w:lvlJc w:val="left"/>
+      <w:pPr>
+        <w:tabs>
+          <w:tab w:val="num" w:pos="5760"/>
+        </w:tabs>
+        <w:ind w:left="5760" w:hanging="360"/>
+      </w:pPr>
+      <w:rPr>
+        <w:rFonts w:ascii="Wingdings" w:hAnsi="Wingdings" w:hint="default"/>
+        <w:sz w:val="20"/>
+      </w:rPr>
+    </w:lvl>
+    <w:lvl w:ilvl="8" w:tentative="1">
+      <w:start w:val="1"/>
+      <w:numFmt w:val="bullet"/>
+      <w:lvlText w:val=""/>
+      <w:lvlJc w:val="left"/>
+      <w:pPr>
+        <w:tabs>
+          <w:tab w:val="num" w:pos="6480"/>
+        </w:tabs>
+        <w:ind w:left="6480" w:hanging="360"/>
+      </w:pPr>
+      <w:rPr>
+        <w:rFonts w:ascii="Wingdings" w:hAnsi="Wingdings" w:hint="default"/>
+        <w:sz w:val="20"/>
+      </w:rPr>
+    </w:lvl>
+  </w:abstractNum>
+  <w:abstractNum w:abstractNumId="6" w15:restartNumberingAfterBreak="0">
+    <w:nsid w:val="664F2AED"/>
+    <w:multiLevelType w:val="multilevel"/>
+    <w:tmpl w:val="EB0009C8"/>
+    <w:lvl w:ilvl="0">
+      <w:start w:val="1"/>
+      <w:numFmt w:val="bullet"/>
+      <w:lvlText w:val=""/>
+      <w:lvlJc w:val="left"/>
+      <w:pPr>
+        <w:tabs>
+          <w:tab w:val="num" w:pos="720"/>
+        </w:tabs>
+        <w:ind w:left="720" w:hanging="360"/>
+      </w:pPr>
+      <w:rPr>
+        <w:rFonts w:ascii="Symbol" w:hAnsi="Symbol" w:hint="default"/>
+        <w:sz w:val="20"/>
+      </w:rPr>
+    </w:lvl>
+    <w:lvl w:ilvl="1" w:tentative="1">
+      <w:start w:val="1"/>
+      <w:numFmt w:val="bullet"/>
+      <w:lvlText w:val="o"/>
+      <w:lvlJc w:val="left"/>
+      <w:pPr>
+        <w:tabs>
+          <w:tab w:val="num" w:pos="1440"/>
+        </w:tabs>
+        <w:ind w:left="1440" w:hanging="360"/>
+      </w:pPr>
+      <w:rPr>
+        <w:rFonts w:ascii="Courier New" w:hAnsi="Courier New" w:hint="default"/>
+        <w:sz w:val="20"/>
+      </w:rPr>
+    </w:lvl>
+    <w:lvl w:ilvl="2" w:tentative="1">
+      <w:start w:val="1"/>
+      <w:numFmt w:val="bullet"/>
+      <w:lvlText w:val=""/>
+      <w:lvlJc w:val="left"/>
+      <w:pPr>
+        <w:tabs>
+          <w:tab w:val="num" w:pos="2160"/>
+        </w:tabs>
+        <w:ind w:left="2160" w:hanging="360"/>
+      </w:pPr>
+      <w:rPr>
+        <w:rFonts w:ascii="Wingdings" w:hAnsi="Wingdings" w:hint="default"/>
+        <w:sz w:val="20"/>
+      </w:rPr>
+    </w:lvl>
+    <w:lvl w:ilvl="3" w:tentative="1">
+      <w:start w:val="1"/>
+      <w:numFmt w:val="bullet"/>
+      <w:lvlText w:val=""/>
+      <w:lvlJc w:val="left"/>
+      <w:pPr>
+        <w:tabs>
+          <w:tab w:val="num" w:pos="2880"/>
+        </w:tabs>
+        <w:ind w:left="2880" w:hanging="360"/>
+      </w:pPr>
+      <w:rPr>
+        <w:rFonts w:ascii="Wingdings" w:hAnsi="Wingdings" w:hint="default"/>
+        <w:sz w:val="20"/>
+      </w:rPr>
+    </w:lvl>
+    <w:lvl w:ilvl="4" w:tentative="1">
+      <w:start w:val="1"/>
+      <w:numFmt w:val="bullet"/>
+      <w:lvlText w:val=""/>
+      <w:lvlJc w:val="left"/>
+      <w:pPr>
+        <w:tabs>
+          <w:tab w:val="num" w:pos="3600"/>
+        </w:tabs>
+        <w:ind w:left="3600" w:hanging="360"/>
+      </w:pPr>
+      <w:rPr>
+        <w:rFonts w:ascii="Wingdings" w:hAnsi="Wingdings" w:hint="default"/>
+        <w:sz w:val="20"/>
+      </w:rPr>
+    </w:lvl>
+    <w:lvl w:ilvl="5" w:tentative="1">
+      <w:start w:val="1"/>
+      <w:numFmt w:val="bullet"/>
+      <w:lvlText w:val=""/>
+      <w:lvlJc w:val="left"/>
+      <w:pPr>
+        <w:tabs>
+          <w:tab w:val="num" w:pos="4320"/>
+        </w:tabs>
+        <w:ind w:left="4320" w:hanging="360"/>
+      </w:pPr>
+      <w:rPr>
+        <w:rFonts w:ascii="Wingdings" w:hAnsi="Wingdings" w:hint="default"/>
+        <w:sz w:val="20"/>
+      </w:rPr>
+    </w:lvl>
+    <w:lvl w:ilvl="6" w:tentative="1">
+      <w:start w:val="1"/>
+      <w:numFmt w:val="bullet"/>
+      <w:lvlText w:val=""/>
+      <w:lvlJc w:val="left"/>
+      <w:pPr>
+        <w:tabs>
+          <w:tab w:val="num" w:pos="5040"/>
+        </w:tabs>
+        <w:ind w:left="5040" w:hanging="360"/>
+      </w:pPr>
+      <w:rPr>
+        <w:rFonts w:ascii="Wingdings" w:hAnsi="Wingdings" w:hint="default"/>
+        <w:sz w:val="20"/>
+      </w:rPr>
+    </w:lvl>
+    <w:lvl w:ilvl="7" w:tentative="1">
+      <w:start w:val="1"/>
+      <w:numFmt w:val="bullet"/>
+      <w:lvlText w:val=""/>
+      <w:lvlJc w:val="left"/>
+      <w:pPr>
+        <w:tabs>
+          <w:tab w:val="num" w:pos="5760"/>
+        </w:tabs>
+        <w:ind w:left="5760" w:hanging="360"/>
+      </w:pPr>
+      <w:rPr>
+        <w:rFonts w:ascii="Wingdings" w:hAnsi="Wingdings" w:hint="default"/>
+        <w:sz w:val="20"/>
+      </w:rPr>
+    </w:lvl>
+    <w:lvl w:ilvl="8" w:tentative="1">
+      <w:start w:val="1"/>
+      <w:numFmt w:val="bullet"/>
+      <w:lvlText w:val=""/>
+      <w:lvlJc w:val="left"/>
+      <w:pPr>
+        <w:tabs>
+          <w:tab w:val="num" w:pos="6480"/>
+        </w:tabs>
+        <w:ind w:left="6480" w:hanging="360"/>
+      </w:pPr>
+      <w:rPr>
+        <w:rFonts w:ascii="Wingdings" w:hAnsi="Wingdings" w:hint="default"/>
+        <w:sz w:val="20"/>
+      </w:rPr>
+    </w:lvl>
+  </w:abstractNum>
+  <w:abstractNum w:abstractNumId="7" w15:restartNumberingAfterBreak="0">
     <w:nsid w:val="6835125A"/>
     <w:multiLevelType w:val="multilevel"/>
     <w:tmpl w:val="6FA2F902"/>
@@ -2001,13 +4263,28 @@
     </w:lvl>
   </w:abstractNum>
   <w:num w:numId="1" w16cid:durableId="588852855">
-    <w:abstractNumId w:val="0"/>
+    <w:abstractNumId w:val="3"/>
   </w:num>
   <w:num w:numId="2" w16cid:durableId="1894197806">
+    <w:abstractNumId w:val="4"/>
+  </w:num>
+  <w:num w:numId="3" w16cid:durableId="939027820">
+    <w:abstractNumId w:val="7"/>
+  </w:num>
+  <w:num w:numId="4" w16cid:durableId="393820219">
     <w:abstractNumId w:val="1"/>
   </w:num>
-  <w:num w:numId="3" w16cid:durableId="939027820">
+  <w:num w:numId="5" w16cid:durableId="1246111240">
+    <w:abstractNumId w:val="6"/>
+  </w:num>
+  <w:num w:numId="6" w16cid:durableId="1993562827">
     <w:abstractNumId w:val="2"/>
+  </w:num>
+  <w:num w:numId="7" w16cid:durableId="1158960344">
+    <w:abstractNumId w:val="5"/>
+  </w:num>
+  <w:num w:numId="8" w16cid:durableId="1710687500">
+    <w:abstractNumId w:val="0"/>
   </w:num>
 </w:numbering>
 </file>
@@ -2621,7 +4898,6 @@
   <w:style w:type="character" w:default="1" w:styleId="DefaultParagraphFont">
     <w:name w:val="Default Paragraph Font"/>
     <w:uiPriority w:val="1"/>
-    <w:semiHidden/>
     <w:unhideWhenUsed/>
   </w:style>
   <w:style w:type="table" w:default="1" w:styleId="TableNormal">

</xml_diff>